<commit_message>
lên khung sườn cho repo
</commit_message>
<xml_diff>
--- a/Plan DSA.docx
+++ b/Plan DSA.docx
@@ -26,30 +26,342 @@
       <w:pPr>
         <w:spacing w:after="300"/>
         <w:jc w:val="center"/>
-      </w:pPr>
-      <w:r>
         <w:rPr>
           <w:b/>
           <w:bCs/>
           <w:sz w:val="28"/>
           <w:szCs w:val="28"/>
+          <w:lang w:val="en-US"/>
+        </w:rPr>
+      </w:pPr>
+      <w:r>
+        <w:rPr>
+          <w:b/>
+          <w:bCs/>
+          <w:sz w:val="28"/>
+          <w:szCs w:val="28"/>
         </w:rPr>
         <w:t>Học phần: Cấu trúc Dữ liệu và Giải thuật (DASA230179)</w:t>
       </w:r>
+    </w:p>
+    <w:p>
+      <w:pPr>
+        <w:spacing w:after="300"/>
+        <w:jc w:val="center"/>
+        <w:rPr>
+          <w:b/>
+          <w:bCs/>
+          <w:sz w:val="28"/>
+          <w:szCs w:val="28"/>
+          <w:lang w:val="en-US"/>
+        </w:rPr>
+      </w:pPr>
+    </w:p>
+    <w:p>
+      <w:pPr>
+        <w:spacing w:after="300"/>
+        <w:jc w:val="center"/>
+        <w:rPr>
+          <w:b/>
+          <w:bCs/>
+          <w:sz w:val="28"/>
+          <w:szCs w:val="28"/>
+          <w:lang w:val="en-US"/>
+        </w:rPr>
+      </w:pPr>
+    </w:p>
+    <w:p>
+      <w:pPr>
+        <w:spacing w:after="300"/>
+        <w:jc w:val="center"/>
+        <w:rPr>
+          <w:b/>
+          <w:bCs/>
+          <w:sz w:val="40"/>
+          <w:szCs w:val="40"/>
+          <w:lang w:val="en-US"/>
+        </w:rPr>
+      </w:pPr>
     </w:p>
     <w:p>
       <w:pPr>
         <w:spacing w:after="500"/>
         <w:jc w:val="center"/>
-      </w:pPr>
-      <w:r>
+        <w:rPr>
+          <w:b/>
+          <w:bCs/>
+          <w:color w:val="EE0000"/>
+          <w:sz w:val="44"/>
+          <w:szCs w:val="44"/>
+          <w:lang w:val="en-US"/>
+        </w:rPr>
+      </w:pPr>
+      <w:r>
+        <w:rPr>
+          <w:b/>
+          <w:bCs/>
+          <w:color w:val="EE0000"/>
+          <w:sz w:val="44"/>
+          <w:szCs w:val="44"/>
+        </w:rPr>
+        <w:t>Đề tài: HỆ THỐNG QUẢN LÝ KHO VÀ XỬ LÝ ĐƠN HÀNG THƯƠNG MẠI ĐIỆN TỬ</w:t>
+      </w:r>
+      <w:r>
+        <w:rPr>
+          <w:b/>
+          <w:bCs/>
+          <w:color w:val="EE0000"/>
+          <w:sz w:val="44"/>
+          <w:szCs w:val="44"/>
+          <w:lang w:val="en-US"/>
+        </w:rPr>
+        <w:t xml:space="preserve"> </w:t>
+      </w:r>
+    </w:p>
+    <w:p>
+      <w:pPr>
+        <w:spacing w:after="500"/>
+        <w:jc w:val="center"/>
         <w:rPr>
           <w:b/>
           <w:bCs/>
           <w:sz w:val="32"/>
           <w:szCs w:val="32"/>
-        </w:rPr>
-        <w:t>Đề tài: HỆ THỐNG QUẢN LÝ KHO VÀ XỬ LÝ ĐƠN HÀNG THƯƠNG MẠI ĐIỆN TỬ</w:t>
+          <w:lang w:val="en-US"/>
+        </w:rPr>
+      </w:pPr>
+    </w:p>
+    <w:p>
+      <w:pPr>
+        <w:spacing w:after="500"/>
+        <w:jc w:val="center"/>
+        <w:rPr>
+          <w:b/>
+          <w:bCs/>
+          <w:sz w:val="32"/>
+          <w:szCs w:val="32"/>
+          <w:lang w:val="en-US"/>
+        </w:rPr>
+      </w:pPr>
+    </w:p>
+    <w:p>
+      <w:pPr>
+        <w:spacing w:after="500"/>
+        <w:jc w:val="center"/>
+        <w:rPr>
+          <w:b/>
+          <w:bCs/>
+          <w:sz w:val="32"/>
+          <w:szCs w:val="32"/>
+          <w:lang w:val="en-US"/>
+        </w:rPr>
+      </w:pPr>
+    </w:p>
+    <w:p>
+      <w:pPr>
+        <w:spacing w:after="500"/>
+        <w:rPr>
+          <w:sz w:val="32"/>
+          <w:szCs w:val="32"/>
+          <w:lang w:val="en-US"/>
+        </w:rPr>
+      </w:pPr>
+      <w:r>
+        <w:rPr>
+          <w:b/>
+          <w:bCs/>
+          <w:sz w:val="32"/>
+          <w:szCs w:val="32"/>
+          <w:lang w:val="en-US"/>
+        </w:rPr>
+        <w:t xml:space="preserve">Thành viên: </w:t>
+      </w:r>
+      <w:r>
+        <w:rPr>
+          <w:sz w:val="32"/>
+          <w:szCs w:val="32"/>
+          <w:lang w:val="en-US"/>
+        </w:rPr>
+        <w:t>Hồ Nhật Minh</w:t>
+      </w:r>
+      <w:r>
+        <w:rPr>
+          <w:sz w:val="32"/>
+          <w:szCs w:val="32"/>
+          <w:lang w:val="en-US"/>
+        </w:rPr>
+        <w:t xml:space="preserve"> - </w:t>
+      </w:r>
+      <w:r>
+        <w:rPr>
+          <w:sz w:val="32"/>
+          <w:szCs w:val="32"/>
+        </w:rPr>
+        <w:t>24133039</w:t>
+      </w:r>
+    </w:p>
+    <w:p>
+      <w:pPr>
+        <w:spacing w:after="500"/>
+        <w:rPr>
+          <w:sz w:val="32"/>
+          <w:szCs w:val="32"/>
+          <w:lang w:val="en-US"/>
+        </w:rPr>
+      </w:pPr>
+      <w:r>
+        <w:rPr>
+          <w:sz w:val="32"/>
+          <w:szCs w:val="32"/>
+          <w:lang w:val="en-US"/>
+        </w:rPr>
+        <w:t xml:space="preserve"> </w:t>
+      </w:r>
+      <w:r>
+        <w:rPr>
+          <w:sz w:val="32"/>
+          <w:szCs w:val="32"/>
+          <w:lang w:val="en-US"/>
+        </w:rPr>
+        <w:tab/>
+      </w:r>
+      <w:r>
+        <w:rPr>
+          <w:sz w:val="32"/>
+          <w:szCs w:val="32"/>
+          <w:lang w:val="en-US"/>
+        </w:rPr>
+        <w:tab/>
+        <w:t xml:space="preserve">    </w:t>
+      </w:r>
+      <w:r>
+        <w:rPr>
+          <w:sz w:val="32"/>
+          <w:szCs w:val="32"/>
+        </w:rPr>
+        <w:t>Dương Thị Kim Ngân</w:t>
+      </w:r>
+      <w:r>
+        <w:rPr>
+          <w:sz w:val="32"/>
+          <w:szCs w:val="32"/>
+          <w:lang w:val="en-US"/>
+        </w:rPr>
+        <w:t xml:space="preserve"> - </w:t>
+      </w:r>
+      <w:r>
+        <w:rPr>
+          <w:sz w:val="32"/>
+          <w:szCs w:val="32"/>
+          <w:lang w:val="en-US"/>
+        </w:rPr>
+        <w:t>24133040</w:t>
+      </w:r>
+    </w:p>
+    <w:p>
+      <w:pPr>
+        <w:spacing w:after="500"/>
+        <w:rPr>
+          <w:sz w:val="32"/>
+          <w:szCs w:val="32"/>
+          <w:lang w:val="en-US"/>
+        </w:rPr>
+      </w:pPr>
+      <w:r>
+        <w:rPr>
+          <w:sz w:val="32"/>
+          <w:szCs w:val="32"/>
+          <w:lang w:val="en-US"/>
+        </w:rPr>
+        <w:t xml:space="preserve">                      </w:t>
+      </w:r>
+      <w:r>
+        <w:rPr>
+          <w:sz w:val="32"/>
+          <w:szCs w:val="32"/>
+        </w:rPr>
+        <w:t>Nguyễn Thị Kiều Trang</w:t>
+      </w:r>
+      <w:r>
+        <w:rPr>
+          <w:sz w:val="32"/>
+          <w:szCs w:val="32"/>
+          <w:lang w:val="en-US"/>
+        </w:rPr>
+        <w:t xml:space="preserve"> - </w:t>
+      </w:r>
+      <w:r>
+        <w:rPr>
+          <w:sz w:val="32"/>
+          <w:szCs w:val="32"/>
+        </w:rPr>
+        <w:t>24133064</w:t>
+      </w:r>
+    </w:p>
+    <w:p>
+      <w:pPr>
+        <w:spacing w:after="500"/>
+        <w:rPr>
+          <w:sz w:val="32"/>
+          <w:szCs w:val="32"/>
+          <w:lang w:val="en-US"/>
+        </w:rPr>
+      </w:pPr>
+      <w:r>
+        <w:rPr>
+          <w:sz w:val="32"/>
+          <w:szCs w:val="32"/>
+          <w:lang w:val="en-US"/>
+        </w:rPr>
+        <w:t xml:space="preserve">                      </w:t>
+      </w:r>
+      <w:r>
+        <w:rPr>
+          <w:sz w:val="32"/>
+          <w:szCs w:val="32"/>
+        </w:rPr>
+        <w:t>Nguyễn Thị Ngọc Trâm</w:t>
+      </w:r>
+      <w:r>
+        <w:rPr>
+          <w:sz w:val="32"/>
+          <w:szCs w:val="32"/>
+          <w:lang w:val="en-US"/>
+        </w:rPr>
+        <w:t xml:space="preserve"> - </w:t>
+      </w:r>
+      <w:r>
+        <w:rPr>
+          <w:sz w:val="32"/>
+          <w:szCs w:val="32"/>
+        </w:rPr>
+        <w:t>24133066</w:t>
+      </w:r>
+    </w:p>
+    <w:p>
+      <w:pPr>
+        <w:spacing w:after="500"/>
+        <w:rPr>
+          <w:sz w:val="24"/>
+          <w:szCs w:val="24"/>
+          <w:lang w:val="en-US"/>
+        </w:rPr>
+      </w:pPr>
+      <w:r>
+        <w:rPr>
+          <w:sz w:val="32"/>
+          <w:szCs w:val="32"/>
+          <w:lang w:val="en-US"/>
+        </w:rPr>
+        <w:t xml:space="preserve">                      </w:t>
+      </w:r>
+      <w:r>
+        <w:rPr>
+          <w:sz w:val="32"/>
+          <w:szCs w:val="32"/>
+          <w:lang w:val="en-US"/>
+        </w:rPr>
+        <w:t>Bùi Nguyễn Nguyên Khang - 24133902</w:t>
       </w:r>
     </w:p>
     <w:p>
@@ -91,6 +403,7 @@
     <w:p>
       <w:pPr>
         <w:spacing w:after="160" w:line="360" w:lineRule="auto"/>
+        <w:ind w:firstLine="720"/>
         <w:jc w:val="both"/>
       </w:pPr>
       <w:r>
@@ -100,6 +413,7 @@
     <w:p>
       <w:pPr>
         <w:spacing w:after="160" w:line="360" w:lineRule="auto"/>
+        <w:ind w:firstLine="720"/>
         <w:jc w:val="both"/>
       </w:pPr>
       <w:r>
@@ -292,6 +606,16 @@
     </w:p>
     <w:p>
       <w:pPr>
+        <w:rPr>
+          <w:lang w:val="en-US"/>
+        </w:rPr>
+      </w:pPr>
+      <w:r>
+        <w:br w:type="page"/>
+      </w:r>
+    </w:p>
+    <w:p>
+      <w:pPr>
         <w:pStyle w:val="Heading2"/>
         <w:spacing w:before="300" w:after="160"/>
       </w:pPr>
@@ -303,20 +627,18 @@
           <w:sz w:val="28"/>
           <w:szCs w:val="28"/>
         </w:rPr>
+        <w:lastRenderedPageBreak/>
         <w:t>1.3 Ba yêu cầu do nhóm tự phát hiện</w:t>
       </w:r>
     </w:p>
     <w:p>
       <w:pPr>
         <w:spacing w:after="160" w:line="360" w:lineRule="auto"/>
+        <w:ind w:firstLine="720"/>
         <w:jc w:val="both"/>
       </w:pPr>
       <w:r>
-        <w:t xml:space="preserve">Ngoài hai yêu cầu bắt buộc, nhóm đọc kỹ mô tả lĩnh vực trong đề bài, trong đó nhắc đến cơ chế ưu tiên xử lý đơn gấp và danh sách sản phẩm vừa được xem hoặc vừa nhập </w:t>
-      </w:r>
-      <w:r>
-        <w:lastRenderedPageBreak/>
-        <w:t>kho. Từ đó nhóm xác định ba thao tác thực sự cần thiết cho một hệ thống kho vận hành thật, chưa được nêu tên cấu trúc, và đủ khác biệt so với MC1, MC2.</w:t>
+        <w:t>Ngoài hai yêu cầu bắt buộc, nhóm đọc kỹ mô tả lĩnh vực trong đề bài, trong đó nhắc đến cơ chế ưu tiên xử lý đơn gấp và danh sách sản phẩm vừa được xem hoặc vừa nhập kho. Từ đó nhóm xác định ba thao tác thực sự cần thiết cho một hệ thống kho vận hành thật, chưa được nêu tên cấu trúc, và đủ khác biệt so với MC1, MC2.</w:t>
       </w:r>
     </w:p>
     <w:tbl>
@@ -342,12 +664,6 @@
         <w:gridCol w:w="4160"/>
       </w:tblGrid>
       <w:tr>
-        <w:tblPrEx>
-          <w:tblCellMar>
-            <w:top w:w="0" w:type="dxa"/>
-            <w:bottom w:w="0" w:type="dxa"/>
-          </w:tblCellMar>
-        </w:tblPrEx>
         <w:trPr>
           <w:trHeight w:val="401"/>
           <w:tblHeader/>
@@ -432,12 +748,6 @@
         </w:tc>
       </w:tr>
       <w:tr>
-        <w:tblPrEx>
-          <w:tblCellMar>
-            <w:top w:w="0" w:type="dxa"/>
-            <w:bottom w:w="0" w:type="dxa"/>
-          </w:tblCellMar>
-        </w:tblPrEx>
         <w:trPr>
           <w:trHeight w:val="2043"/>
         </w:trPr>
@@ -515,12 +825,6 @@
         </w:tc>
       </w:tr>
       <w:tr>
-        <w:tblPrEx>
-          <w:tblCellMar>
-            <w:top w:w="0" w:type="dxa"/>
-            <w:bottom w:w="0" w:type="dxa"/>
-          </w:tblCellMar>
-        </w:tblPrEx>
         <w:trPr>
           <w:trHeight w:val="2043"/>
         </w:trPr>
@@ -598,12 +902,6 @@
         </w:tc>
       </w:tr>
       <w:tr>
-        <w:tblPrEx>
-          <w:tblCellMar>
-            <w:top w:w="0" w:type="dxa"/>
-            <w:bottom w:w="0" w:type="dxa"/>
-          </w:tblCellMar>
-        </w:tblPrEx>
         <w:trPr>
           <w:trHeight w:val="1711"/>
         </w:trPr>
@@ -685,16 +983,10 @@
       <w:pPr>
         <w:spacing w:after="160" w:line="360" w:lineRule="auto"/>
         <w:jc w:val="both"/>
-      </w:pPr>
-    </w:p>
-    <w:p>
-      <w:pPr>
-        <w:spacing w:after="160" w:line="360" w:lineRule="auto"/>
-        <w:jc w:val="both"/>
-      </w:pPr>
-      <w:r>
-        <w:t>Ba yêu cầu trên được viết hoàn toàn bằng ngôn ngữ nghiệp vụ, không nhắc đến tên bất kỳ cấu trúc dữ liệu nào. Việc chọn cấu trúc cho từng yêu cầu được trình bày ở phần thiết kế bên dưới, sau khi đã hoàn tất phân tích.</w:t>
-      </w:r>
+        <w:rPr>
+          <w:lang w:val="en-US"/>
+        </w:rPr>
+      </w:pPr>
     </w:p>
     <w:p>
       <w:pPr>
@@ -713,6 +1005,7 @@
     <w:p>
       <w:pPr>
         <w:spacing w:after="160" w:line="360" w:lineRule="auto"/>
+        <w:ind w:firstLine="720"/>
         <w:jc w:val="both"/>
       </w:pPr>
       <w:r>
@@ -752,7 +1045,28 @@
           <w:szCs w:val="28"/>
         </w:rPr>
         <w:lastRenderedPageBreak/>
-        <w:t>2.1 MC1 — Tra cứu sản phẩm và đơn hàng theo mã định danh</w:t>
+        <w:t xml:space="preserve">2.1 MC1 </w:t>
+      </w:r>
+      <w:r>
+        <w:rPr>
+          <w:b/>
+          <w:bCs/>
+          <w:color w:val="000000"/>
+          <w:sz w:val="28"/>
+          <w:szCs w:val="28"/>
+          <w:lang w:val="en-US"/>
+        </w:rPr>
+        <w:t>-</w:t>
+      </w:r>
+      <w:r>
+        <w:rPr>
+          <w:b/>
+          <w:bCs/>
+          <w:color w:val="000000"/>
+          <w:sz w:val="28"/>
+          <w:szCs w:val="28"/>
+        </w:rPr>
+        <w:t xml:space="preserve"> Tra cứu sản phẩm và đơn hàng theo mã định danh</w:t>
       </w:r>
     </w:p>
     <w:tbl>
@@ -777,12 +1091,6 @@
         <w:gridCol w:w="6700"/>
       </w:tblGrid>
       <w:tr>
-        <w:tblPrEx>
-          <w:tblCellMar>
-            <w:top w:w="0" w:type="dxa"/>
-            <w:bottom w:w="0" w:type="dxa"/>
-          </w:tblCellMar>
-        </w:tblPrEx>
         <w:trPr>
           <w:tblHeader/>
         </w:trPr>
@@ -840,12 +1148,6 @@
         </w:tc>
       </w:tr>
       <w:tr>
-        <w:tblPrEx>
-          <w:tblCellMar>
-            <w:top w:w="0" w:type="dxa"/>
-            <w:bottom w:w="0" w:type="dxa"/>
-          </w:tblCellMar>
-        </w:tblPrEx>
         <w:tc>
           <w:tcPr>
             <w:tcW w:w="2600" w:type="dxa"/>
@@ -896,12 +1198,6 @@
         </w:tc>
       </w:tr>
       <w:tr>
-        <w:tblPrEx>
-          <w:tblCellMar>
-            <w:top w:w="0" w:type="dxa"/>
-            <w:bottom w:w="0" w:type="dxa"/>
-          </w:tblCellMar>
-        </w:tblPrEx>
         <w:tc>
           <w:tcPr>
             <w:tcW w:w="2600" w:type="dxa"/>
@@ -952,12 +1248,6 @@
         </w:tc>
       </w:tr>
       <w:tr>
-        <w:tblPrEx>
-          <w:tblCellMar>
-            <w:top w:w="0" w:type="dxa"/>
-            <w:bottom w:w="0" w:type="dxa"/>
-          </w:tblCellMar>
-        </w:tblPrEx>
         <w:tc>
           <w:tcPr>
             <w:tcW w:w="2600" w:type="dxa"/>
@@ -1008,12 +1298,6 @@
         </w:tc>
       </w:tr>
       <w:tr>
-        <w:tblPrEx>
-          <w:tblCellMar>
-            <w:top w:w="0" w:type="dxa"/>
-            <w:bottom w:w="0" w:type="dxa"/>
-          </w:tblCellMar>
-        </w:tblPrEx>
         <w:tc>
           <w:tcPr>
             <w:tcW w:w="2600" w:type="dxa"/>
@@ -1064,12 +1348,6 @@
         </w:tc>
       </w:tr>
     </w:tbl>
-    <w:p>
-      <w:pPr>
-        <w:spacing w:after="160" w:line="360" w:lineRule="auto"/>
-        <w:jc w:val="both"/>
-      </w:pPr>
-    </w:p>
     <w:p>
       <w:pPr>
         <w:spacing w:after="160" w:line="360" w:lineRule="auto"/>
@@ -1092,7 +1370,28 @@
           <w:sz w:val="28"/>
           <w:szCs w:val="28"/>
         </w:rPr>
-        <w:t>2.2 MC2 — Lấy đơn hàng ưu tiên xử lý tiếp theo</w:t>
+        <w:t xml:space="preserve">2.2 MC2 </w:t>
+      </w:r>
+      <w:r>
+        <w:rPr>
+          <w:b/>
+          <w:bCs/>
+          <w:color w:val="000000"/>
+          <w:sz w:val="28"/>
+          <w:szCs w:val="28"/>
+          <w:lang w:val="en-US"/>
+        </w:rPr>
+        <w:t>-</w:t>
+      </w:r>
+      <w:r>
+        <w:rPr>
+          <w:b/>
+          <w:bCs/>
+          <w:color w:val="000000"/>
+          <w:sz w:val="28"/>
+          <w:szCs w:val="28"/>
+        </w:rPr>
+        <w:t xml:space="preserve"> Lấy đơn hàng ưu tiên xử lý tiếp theo</w:t>
       </w:r>
     </w:p>
     <w:tbl>
@@ -1117,12 +1416,6 @@
         <w:gridCol w:w="6700"/>
       </w:tblGrid>
       <w:tr>
-        <w:tblPrEx>
-          <w:tblCellMar>
-            <w:top w:w="0" w:type="dxa"/>
-            <w:bottom w:w="0" w:type="dxa"/>
-          </w:tblCellMar>
-        </w:tblPrEx>
         <w:trPr>
           <w:tblHeader/>
         </w:trPr>
@@ -1180,12 +1473,6 @@
         </w:tc>
       </w:tr>
       <w:tr>
-        <w:tblPrEx>
-          <w:tblCellMar>
-            <w:top w:w="0" w:type="dxa"/>
-            <w:bottom w:w="0" w:type="dxa"/>
-          </w:tblCellMar>
-        </w:tblPrEx>
         <w:tc>
           <w:tcPr>
             <w:tcW w:w="2600" w:type="dxa"/>
@@ -1236,12 +1523,6 @@
         </w:tc>
       </w:tr>
       <w:tr>
-        <w:tblPrEx>
-          <w:tblCellMar>
-            <w:top w:w="0" w:type="dxa"/>
-            <w:bottom w:w="0" w:type="dxa"/>
-          </w:tblCellMar>
-        </w:tblPrEx>
         <w:tc>
           <w:tcPr>
             <w:tcW w:w="2600" w:type="dxa"/>
@@ -1292,12 +1573,6 @@
         </w:tc>
       </w:tr>
       <w:tr>
-        <w:tblPrEx>
-          <w:tblCellMar>
-            <w:top w:w="0" w:type="dxa"/>
-            <w:bottom w:w="0" w:type="dxa"/>
-          </w:tblCellMar>
-        </w:tblPrEx>
         <w:tc>
           <w:tcPr>
             <w:tcW w:w="2600" w:type="dxa"/>
@@ -1348,12 +1623,6 @@
         </w:tc>
       </w:tr>
       <w:tr>
-        <w:tblPrEx>
-          <w:tblCellMar>
-            <w:top w:w="0" w:type="dxa"/>
-            <w:bottom w:w="0" w:type="dxa"/>
-          </w:tblCellMar>
-        </w:tblPrEx>
         <w:tc>
           <w:tcPr>
             <w:tcW w:w="2600" w:type="dxa"/>
@@ -1433,23 +1702,8 @@
           <w:sz w:val="28"/>
           <w:szCs w:val="28"/>
         </w:rPr>
-        <w:t>2.3 TP1 — Giữ thứ tự đến trước trong cùng một mức ưu tiên</w:t>
-      </w:r>
-    </w:p>
-    <w:p>
-      <w:pPr>
-        <w:spacing w:after="160" w:line="360" w:lineRule="auto"/>
-        <w:jc w:val="both"/>
-      </w:pPr>
-      <w:r>
-        <w:t>Đây chính là yêu cầu xung đột trực tiếp với MC2, được phân tích chi tiết ở Mục 3. Ở đây chỉ nêu tóm tắt: cấu trúc ưu tiên phần tử cực trị chọn ở MC2 không tự động giữ đúng thứ tự đến trước giữa các phần tử có cùng mức ưu tiên, vì thứ tự nội bộ của cấu trúc này phụ thuộc vào cách nó tự sắp xếp bên trong, không phải theo thời điểm chèn vào.</w:t>
-      </w:r>
-    </w:p>
-    <w:p>
-      <w:pPr>
-        <w:pStyle w:val="Heading2"/>
-        <w:spacing w:before="300" w:after="160"/>
-      </w:pPr>
+        <w:t xml:space="preserve">2.3 TP1 </w:t>
+      </w:r>
       <w:r>
         <w:rPr>
           <w:b/>
@@ -1457,8 +1711,66 @@
           <w:color w:val="000000"/>
           <w:sz w:val="28"/>
           <w:szCs w:val="28"/>
-        </w:rPr>
-        <w:t>2.4 TP2 — Tìm kiếm sản phẩm theo tiền tố</w:t>
+          <w:lang w:val="en-US"/>
+        </w:rPr>
+        <w:t>-</w:t>
+      </w:r>
+      <w:r>
+        <w:rPr>
+          <w:b/>
+          <w:bCs/>
+          <w:color w:val="000000"/>
+          <w:sz w:val="28"/>
+          <w:szCs w:val="28"/>
+        </w:rPr>
+        <w:t xml:space="preserve"> Giữ thứ tự đến trước trong cùng một mức ưu tiên</w:t>
+      </w:r>
+    </w:p>
+    <w:p>
+      <w:pPr>
+        <w:spacing w:after="160" w:line="360" w:lineRule="auto"/>
+        <w:ind w:firstLine="720"/>
+        <w:jc w:val="both"/>
+      </w:pPr>
+      <w:r>
+        <w:t>Đây chính là yêu cầu xung đột trực tiếp với MC2, được phân tích chi tiết ở Mục 3. Ở đây chỉ nêu tóm tắt: cấu trúc ưu tiên phần tử cực trị chọn ở MC2 không tự động giữ đúng thứ tự đến trước giữa các phần tử có cùng mức ưu tiên, vì thứ tự nội bộ của cấu trúc này phụ thuộc vào cách nó tự sắp xếp bên trong, không phải theo thời điểm chèn vào.</w:t>
+      </w:r>
+    </w:p>
+    <w:p>
+      <w:pPr>
+        <w:pStyle w:val="Heading2"/>
+        <w:spacing w:before="300" w:after="160"/>
+      </w:pPr>
+      <w:r>
+        <w:rPr>
+          <w:b/>
+          <w:bCs/>
+          <w:color w:val="000000"/>
+          <w:sz w:val="28"/>
+          <w:szCs w:val="28"/>
+        </w:rPr>
+        <w:t xml:space="preserve">2.4 TP2 </w:t>
+      </w:r>
+      <w:r>
+        <w:rPr>
+          <w:b/>
+          <w:bCs/>
+          <w:color w:val="000000"/>
+          <w:sz w:val="28"/>
+          <w:szCs w:val="28"/>
+          <w:lang w:val="en-US"/>
+        </w:rPr>
+        <w:t>-</w:t>
+      </w:r>
+      <w:r>
+        <w:rPr>
+          <w:b/>
+          <w:bCs/>
+          <w:color w:val="000000"/>
+          <w:sz w:val="28"/>
+          <w:szCs w:val="28"/>
+        </w:rPr>
+        <w:t xml:space="preserve"> Tìm kiếm sản phẩm theo tiền tố</w:t>
       </w:r>
     </w:p>
     <w:tbl>
@@ -1483,12 +1795,6 @@
         <w:gridCol w:w="6700"/>
       </w:tblGrid>
       <w:tr>
-        <w:tblPrEx>
-          <w:tblCellMar>
-            <w:top w:w="0" w:type="dxa"/>
-            <w:bottom w:w="0" w:type="dxa"/>
-          </w:tblCellMar>
-        </w:tblPrEx>
         <w:trPr>
           <w:tblHeader/>
         </w:trPr>
@@ -1546,12 +1852,6 @@
         </w:tc>
       </w:tr>
       <w:tr>
-        <w:tblPrEx>
-          <w:tblCellMar>
-            <w:top w:w="0" w:type="dxa"/>
-            <w:bottom w:w="0" w:type="dxa"/>
-          </w:tblCellMar>
-        </w:tblPrEx>
         <w:tc>
           <w:tcPr>
             <w:tcW w:w="2600" w:type="dxa"/>
@@ -1602,12 +1902,6 @@
         </w:tc>
       </w:tr>
       <w:tr>
-        <w:tblPrEx>
-          <w:tblCellMar>
-            <w:top w:w="0" w:type="dxa"/>
-            <w:bottom w:w="0" w:type="dxa"/>
-          </w:tblCellMar>
-        </w:tblPrEx>
         <w:tc>
           <w:tcPr>
             <w:tcW w:w="2600" w:type="dxa"/>
@@ -1658,12 +1952,6 @@
         </w:tc>
       </w:tr>
       <w:tr>
-        <w:tblPrEx>
-          <w:tblCellMar>
-            <w:top w:w="0" w:type="dxa"/>
-            <w:bottom w:w="0" w:type="dxa"/>
-          </w:tblCellMar>
-        </w:tblPrEx>
         <w:tc>
           <w:tcPr>
             <w:tcW w:w="2600" w:type="dxa"/>
@@ -1714,12 +2002,6 @@
         </w:tc>
       </w:tr>
       <w:tr>
-        <w:tblPrEx>
-          <w:tblCellMar>
-            <w:top w:w="0" w:type="dxa"/>
-            <w:bottom w:w="0" w:type="dxa"/>
-          </w:tblCellMar>
-        </w:tblPrEx>
         <w:tc>
           <w:tcPr>
             <w:tcW w:w="2600" w:type="dxa"/>
@@ -1818,7 +2100,28 @@
           <w:szCs w:val="28"/>
         </w:rPr>
         <w:lastRenderedPageBreak/>
-        <w:t>2.5 TP3 — Danh sách sản phẩm vừa cập nhật gần nhất</w:t>
+        <w:t xml:space="preserve">2.5 TP3 </w:t>
+      </w:r>
+      <w:r>
+        <w:rPr>
+          <w:b/>
+          <w:bCs/>
+          <w:color w:val="000000"/>
+          <w:sz w:val="28"/>
+          <w:szCs w:val="28"/>
+          <w:lang w:val="en-US"/>
+        </w:rPr>
+        <w:t>-</w:t>
+      </w:r>
+      <w:r>
+        <w:rPr>
+          <w:b/>
+          <w:bCs/>
+          <w:color w:val="000000"/>
+          <w:sz w:val="28"/>
+          <w:szCs w:val="28"/>
+        </w:rPr>
+        <w:t xml:space="preserve"> Danh sách sản phẩm vừa cập nhật gần nhất</w:t>
       </w:r>
     </w:p>
     <w:tbl>
@@ -1843,12 +2146,6 @@
         <w:gridCol w:w="6700"/>
       </w:tblGrid>
       <w:tr>
-        <w:tblPrEx>
-          <w:tblCellMar>
-            <w:top w:w="0" w:type="dxa"/>
-            <w:bottom w:w="0" w:type="dxa"/>
-          </w:tblCellMar>
-        </w:tblPrEx>
         <w:trPr>
           <w:tblHeader/>
         </w:trPr>
@@ -1906,12 +2203,6 @@
         </w:tc>
       </w:tr>
       <w:tr>
-        <w:tblPrEx>
-          <w:tblCellMar>
-            <w:top w:w="0" w:type="dxa"/>
-            <w:bottom w:w="0" w:type="dxa"/>
-          </w:tblCellMar>
-        </w:tblPrEx>
         <w:tc>
           <w:tcPr>
             <w:tcW w:w="2600" w:type="dxa"/>
@@ -1962,12 +2253,6 @@
         </w:tc>
       </w:tr>
       <w:tr>
-        <w:tblPrEx>
-          <w:tblCellMar>
-            <w:top w:w="0" w:type="dxa"/>
-            <w:bottom w:w="0" w:type="dxa"/>
-          </w:tblCellMar>
-        </w:tblPrEx>
         <w:tc>
           <w:tcPr>
             <w:tcW w:w="2600" w:type="dxa"/>
@@ -2018,12 +2303,6 @@
         </w:tc>
       </w:tr>
       <w:tr>
-        <w:tblPrEx>
-          <w:tblCellMar>
-            <w:top w:w="0" w:type="dxa"/>
-            <w:bottom w:w="0" w:type="dxa"/>
-          </w:tblCellMar>
-        </w:tblPrEx>
         <w:tc>
           <w:tcPr>
             <w:tcW w:w="2600" w:type="dxa"/>
@@ -2074,12 +2353,6 @@
         </w:tc>
       </w:tr>
       <w:tr>
-        <w:tblPrEx>
-          <w:tblCellMar>
-            <w:top w:w="0" w:type="dxa"/>
-            <w:bottom w:w="0" w:type="dxa"/>
-          </w:tblCellMar>
-        </w:tblPrEx>
         <w:tc>
           <w:tcPr>
             <w:tcW w:w="2600" w:type="dxa"/>
@@ -2130,12 +2403,6 @@
         </w:tc>
       </w:tr>
     </w:tbl>
-    <w:p>
-      <w:pPr>
-        <w:spacing w:after="160" w:line="360" w:lineRule="auto"/>
-        <w:jc w:val="both"/>
-      </w:pPr>
-    </w:p>
     <w:p>
       <w:pPr>
         <w:spacing w:after="160" w:line="360" w:lineRule="auto"/>
@@ -2178,6 +2445,7 @@
     <w:p>
       <w:pPr>
         <w:spacing w:after="160" w:line="360" w:lineRule="auto"/>
+        <w:ind w:firstLine="720"/>
         <w:jc w:val="both"/>
       </w:pPr>
       <w:r>
@@ -2187,7 +2455,11 @@
     <w:p>
       <w:pPr>
         <w:spacing w:after="160" w:line="360" w:lineRule="auto"/>
+        <w:ind w:firstLine="720"/>
         <w:jc w:val="both"/>
+        <w:rPr>
+          <w:lang w:val="en-US"/>
+        </w:rPr>
       </w:pPr>
       <w:r>
         <w:t>Đây không phải là một xung đột được tạo ra một cách gượng ép để cho đủ yêu cầu. Nó phản ánh đúng một tình huống có thật trong vận hành kho: hai đơn cùng được đánh dấu gấp nhưng tạo lệnh cách nhau vài phút, nếu xử lý sai thứ tự sẽ gây khiếu nại từ khách đặt trước.</w:t>
@@ -2197,56 +2469,73 @@
       <w:pPr>
         <w:pStyle w:val="Heading2"/>
         <w:spacing w:before="300" w:after="160"/>
-      </w:pPr>
-      <w:r>
         <w:rPr>
           <w:b/>
           <w:bCs/>
           <w:color w:val="000000"/>
           <w:sz w:val="28"/>
           <w:szCs w:val="28"/>
-        </w:rPr>
-        <w:lastRenderedPageBreak/>
-        <w:t>3.2 Hướng giải quyết</w:t>
-      </w:r>
-    </w:p>
-    <w:p>
-      <w:pPr>
-        <w:spacing w:after="160" w:line="360" w:lineRule="auto"/>
-        <w:jc w:val="both"/>
-      </w:pPr>
-      <w:r>
-        <w:t>Nhóm chọn hướng kết hợp cấu trúc thay vì đánh đổi. Lý do là cả hai yêu cầu MC2 và TP1 đều là thao tác lõi, xảy ra thường xuyên trong vận hành thực tế, nên việc hy sinh một trong hai để đơn giản hóa cài đặt sẽ khiến hệ thống không đáp ứng đúng nhu cầu thật.</w:t>
-      </w:r>
-    </w:p>
-    <w:p>
-      <w:pPr>
-        <w:spacing w:after="160" w:line="360" w:lineRule="auto"/>
-        <w:jc w:val="both"/>
-      </w:pPr>
-      <w:r>
-        <w:t>Cách kết hợp cụ thể: mỗi đơn hàng khi được đưa vào hàng đợi xử lý sẽ mang theo một khóa sắp xếp gồm hai phần, phần đầu là mức ưu tiên, phần sau là một số thứ tự tăng dần theo thời điểm đơn được tạo. Cây đống so sánh đơn hàng trước tiên theo mức ưu tiên, và khi hai đơn có cùng mức ưu tiên thì so sánh tiếp theo số thứ tự thời điểm tạo, đơn có số nhỏ hơn được coi là ưu tiên hơn. Nhờ vậy cây đống vẫn giữ nguyên vai trò lấy ra phần tử ưu tiên cao nhất với chi phí ổn định, đồng thời tự động bảo đảm đúng thứ tự đến trước bên trong từng mức ưu tiên, mà không cần một cấu trúc hàng đợi riêng biệt chạy song song.</w:t>
-      </w:r>
-    </w:p>
-    <w:p>
-      <w:pPr>
-        <w:spacing w:after="160" w:line="360" w:lineRule="auto"/>
-        <w:jc w:val="both"/>
-      </w:pPr>
-      <w:r>
-        <w:t>Điểm khác với ví dụ bộ nhớ đệm giới hạn dung lượng đã học trên lớp: ở đó việc kết hợp cấu trúc là để tra cứu nhanh đồng thời với việc loại bỏ phần tử cũ nhất, còn ở đây việc kết hợp nằm ngay trong cách xây dựng khóa so sánh của một cấu trúc duy nhất, không cần một cấu trúc thứ hai chạy song song và giữ đồng bộ liên tục. Đây là cách nhóm áp dụng đúng tinh thần kết hợp cấu trúc vào một tình huống khác với ví dụ gốc, chứ không sao chép nguyên văn.</w:t>
-      </w:r>
-    </w:p>
-    <w:p>
-      <w:pPr>
-        <w:pStyle w:val="Heading1"/>
-        <w:spacing w:before="400" w:after="200"/>
+          <w:lang w:val="en-US"/>
+        </w:rPr>
+      </w:pPr>
+    </w:p>
+    <w:p>
+      <w:pPr>
+        <w:pStyle w:val="Heading2"/>
+        <w:spacing w:before="300" w:after="160"/>
       </w:pPr>
       <w:r>
         <w:rPr>
           <w:b/>
           <w:bCs/>
           <w:color w:val="000000"/>
+          <w:sz w:val="28"/>
+          <w:szCs w:val="28"/>
+        </w:rPr>
+        <w:lastRenderedPageBreak/>
+        <w:t>3.2 Hướng giải quyết</w:t>
+      </w:r>
+    </w:p>
+    <w:p>
+      <w:pPr>
+        <w:spacing w:after="160" w:line="360" w:lineRule="auto"/>
+        <w:ind w:firstLine="720"/>
+        <w:jc w:val="both"/>
+      </w:pPr>
+      <w:r>
+        <w:t>Nhóm chọn hướng kết hợp cấu trúc thay vì đánh đổi. Lý do là cả hai yêu cầu MC2 và TP1 đều là thao tác lõi, xảy ra thường xuyên trong vận hành thực tế, nên việc hy sinh một trong hai để đơn giản hóa cài đặt sẽ khiến hệ thống không đáp ứng đúng nhu cầu thật.</w:t>
+      </w:r>
+    </w:p>
+    <w:p>
+      <w:pPr>
+        <w:spacing w:after="160" w:line="360" w:lineRule="auto"/>
+        <w:ind w:firstLine="720"/>
+        <w:jc w:val="both"/>
+      </w:pPr>
+      <w:r>
+        <w:t>Cách kết hợp cụ thể: mỗi đơn hàng khi được đưa vào hàng đợi xử lý sẽ mang theo một khóa sắp xếp gồm hai phần, phần đầu là mức ưu tiên, phần sau là một số thứ tự tăng dần theo thời điểm đơn được tạo. Cây đống so sánh đơn hàng trước tiên theo mức ưu tiên, và khi hai đơn có cùng mức ưu tiên thì so sánh tiếp theo số thứ tự thời điểm tạo, đơn có số nhỏ hơn được coi là ưu tiên hơn. Nhờ vậy cây đống vẫn giữ nguyên vai trò lấy ra phần tử ưu tiên cao nhất với chi phí ổn định, đồng thời tự động bảo đảm đúng thứ tự đến trước bên trong từng mức ưu tiên, mà không cần một cấu trúc hàng đợi riêng biệt chạy song song.</w:t>
+      </w:r>
+    </w:p>
+    <w:p>
+      <w:pPr>
+        <w:spacing w:after="160" w:line="360" w:lineRule="auto"/>
+        <w:ind w:firstLine="720"/>
+        <w:jc w:val="both"/>
+      </w:pPr>
+      <w:r>
+        <w:t>Điểm khác với ví dụ bộ nhớ đệm giới hạn dung lượng đã học trên lớp: ở đó việc kết hợp cấu trúc là để tra cứu nhanh đồng thời với việc loại bỏ phần tử cũ nhất, còn ở đây việc kết hợp nằm ngay trong cách xây dựng khóa so sánh của một cấu trúc duy nhất, không cần một cấu trúc thứ hai chạy song song và giữ đồng bộ liên tục. Đây là cách nhóm áp dụng đúng tinh thần kết hợp cấu trúc vào một tình huống khác với ví dụ gốc, chứ không sao chép nguyên văn.</w:t>
+      </w:r>
+    </w:p>
+    <w:p>
+      <w:pPr>
+        <w:pStyle w:val="Heading1"/>
+        <w:spacing w:before="400" w:after="200"/>
+      </w:pPr>
+      <w:r>
+        <w:rPr>
+          <w:b/>
+          <w:bCs/>
+          <w:color w:val="000000"/>
         </w:rPr>
         <w:t>4. Kiến trúc hệ thống ba tầng</w:t>
       </w:r>
@@ -2254,6 +2543,7 @@
     <w:p>
       <w:pPr>
         <w:spacing w:after="160" w:line="360" w:lineRule="auto"/>
+        <w:ind w:firstLine="720"/>
         <w:jc w:val="both"/>
       </w:pPr>
       <w:r>
@@ -2283,12 +2573,6 @@
         <w:gridCol w:w="4800"/>
       </w:tblGrid>
       <w:tr>
-        <w:tblPrEx>
-          <w:tblCellMar>
-            <w:top w:w="0" w:type="dxa"/>
-            <w:bottom w:w="0" w:type="dxa"/>
-          </w:tblCellMar>
-        </w:tblPrEx>
         <w:trPr>
           <w:tblHeader/>
         </w:trPr>
@@ -2372,12 +2656,6 @@
         </w:tc>
       </w:tr>
       <w:tr>
-        <w:tblPrEx>
-          <w:tblCellMar>
-            <w:top w:w="0" w:type="dxa"/>
-            <w:bottom w:w="0" w:type="dxa"/>
-          </w:tblCellMar>
-        </w:tblPrEx>
         <w:tc>
           <w:tcPr>
             <w:tcW w:w="1600" w:type="dxa"/>
@@ -2477,12 +2755,6 @@
         </w:tc>
       </w:tr>
       <w:tr>
-        <w:tblPrEx>
-          <w:tblCellMar>
-            <w:top w:w="0" w:type="dxa"/>
-            <w:bottom w:w="0" w:type="dxa"/>
-          </w:tblCellMar>
-        </w:tblPrEx>
         <w:tc>
           <w:tcPr>
             <w:tcW w:w="1600" w:type="dxa"/>
@@ -2594,12 +2866,6 @@
         </w:tc>
       </w:tr>
       <w:tr>
-        <w:tblPrEx>
-          <w:tblCellMar>
-            <w:top w:w="0" w:type="dxa"/>
-            <w:bottom w:w="0" w:type="dxa"/>
-          </w:tblCellMar>
-        </w:tblPrEx>
         <w:tc>
           <w:tcPr>
             <w:tcW w:w="1600" w:type="dxa"/>
@@ -2691,12 +2957,6 @@
         <w:spacing w:after="160" w:line="360" w:lineRule="auto"/>
         <w:jc w:val="both"/>
       </w:pPr>
-    </w:p>
-    <w:p>
-      <w:pPr>
-        <w:spacing w:after="160" w:line="360" w:lineRule="auto"/>
-        <w:jc w:val="both"/>
-      </w:pPr>
       <w:r>
         <w:t>Nguyên tắc bắt buộc cả nhóm ghi nhớ: bước nạp dữ liệu ban đầu từ tệp CSV hoặc JSON hay từ SQLite chỉ có nhiệm vụ đưa dữ liệu vào bộ nhớ. Mọi câu trả lời cho MC1, MC2, TP1, TP2, TP3 đều phải đi qua các cấu trúc dữ liệu tự cài đặt ở tầng lõi, không được lấy tắt qua câu lệnh truy vấn có sẵn của SQLite.</w:t>
       </w:r>
@@ -2705,6 +2965,9 @@
       <w:pPr>
         <w:pStyle w:val="Heading1"/>
         <w:spacing w:before="400" w:after="200"/>
+        <w:rPr>
+          <w:lang w:val="en-US"/>
+        </w:rPr>
       </w:pPr>
       <w:r>
         <w:rPr>
@@ -2712,12 +2975,13 @@
           <w:bCs/>
           <w:color w:val="000000"/>
         </w:rPr>
-        <w:t>5. Kế hoạch cài đặt và các cấu trúc tự xây dựng từ đầu</w:t>
+        <w:t>5. Kế hoạch cài đặt và các cấu trúc xây dựng</w:t>
       </w:r>
     </w:p>
     <w:p>
       <w:pPr>
         <w:spacing w:after="160" w:line="360" w:lineRule="auto"/>
+        <w:ind w:firstLine="720"/>
         <w:jc w:val="both"/>
       </w:pPr>
       <w:r>
@@ -2742,25 +3006,19 @@
         <w:tblLook w:val="0000" w:firstRow="0" w:lastRow="0" w:firstColumn="0" w:lastColumn="0" w:noHBand="0" w:noVBand="0"/>
       </w:tblPr>
       <w:tblGrid>
-        <w:gridCol w:w="1898"/>
-        <w:gridCol w:w="1675"/>
-        <w:gridCol w:w="4356"/>
+        <w:gridCol w:w="2695"/>
+        <w:gridCol w:w="1440"/>
+        <w:gridCol w:w="3794"/>
         <w:gridCol w:w="1340"/>
       </w:tblGrid>
       <w:tr>
-        <w:tblPrEx>
-          <w:tblCellMar>
-            <w:top w:w="0" w:type="dxa"/>
-            <w:bottom w:w="0" w:type="dxa"/>
-          </w:tblCellMar>
-        </w:tblPrEx>
         <w:trPr>
           <w:trHeight w:val="707"/>
           <w:tblHeader/>
         </w:trPr>
         <w:tc>
           <w:tcPr>
-            <w:tcW w:w="1898" w:type="dxa"/>
+            <w:tcW w:w="2695" w:type="dxa"/>
             <w:tcMar>
               <w:top w:w="80" w:type="dxa"/>
               <w:left w:w="100" w:type="dxa"/>
@@ -2787,7 +3045,7 @@
         </w:tc>
         <w:tc>
           <w:tcPr>
-            <w:tcW w:w="1675" w:type="dxa"/>
+            <w:tcW w:w="1440" w:type="dxa"/>
             <w:tcMar>
               <w:top w:w="80" w:type="dxa"/>
               <w:left w:w="100" w:type="dxa"/>
@@ -2813,7 +3071,7 @@
         </w:tc>
         <w:tc>
           <w:tcPr>
-            <w:tcW w:w="4356" w:type="dxa"/>
+            <w:tcW w:w="3794" w:type="dxa"/>
             <w:tcMar>
               <w:top w:w="80" w:type="dxa"/>
               <w:left w:w="100" w:type="dxa"/>
@@ -2865,42 +3123,84 @@
         </w:tc>
       </w:tr>
       <w:tr>
-        <w:tblPrEx>
-          <w:tblCellMar>
-            <w:top w:w="0" w:type="dxa"/>
-            <w:bottom w:w="0" w:type="dxa"/>
-          </w:tblCellMar>
-        </w:tblPrEx>
         <w:trPr>
           <w:trHeight w:val="2088"/>
         </w:trPr>
         <w:tc>
           <w:tcPr>
-            <w:tcW w:w="1898" w:type="dxa"/>
-            <w:tcMar>
-              <w:top w:w="80" w:type="dxa"/>
-              <w:left w:w="100" w:type="dxa"/>
-              <w:bottom w:w="80" w:type="dxa"/>
-              <w:right w:w="100" w:type="dxa"/>
-            </w:tcMar>
-            <w:vAlign w:val="center"/>
-          </w:tcPr>
-          <w:p>
-            <w:pPr>
-              <w:spacing w:after="60" w:line="300" w:lineRule="auto"/>
-            </w:pPr>
-            <w:r>
-              <w:rPr>
+            <w:tcW w:w="2695" w:type="dxa"/>
+            <w:tcMar>
+              <w:top w:w="80" w:type="dxa"/>
+              <w:left w:w="100" w:type="dxa"/>
+              <w:bottom w:w="80" w:type="dxa"/>
+              <w:right w:w="100" w:type="dxa"/>
+            </w:tcMar>
+            <w:vAlign w:val="center"/>
+          </w:tcPr>
+          <w:p>
+            <w:pPr>
+              <w:spacing w:after="60" w:line="300" w:lineRule="auto"/>
+              <w:rPr>
+                <w:b/>
+                <w:bCs/>
+                <w:sz w:val="22"/>
+                <w:szCs w:val="22"/>
+                <w:lang w:val="en-US"/>
+              </w:rPr>
+            </w:pPr>
+            <w:r>
+              <w:rPr>
+                <w:b/>
+                <w:bCs/>
                 <w:sz w:val="22"/>
                 <w:szCs w:val="22"/>
               </w:rPr>
               <w:t>Cây đống ưu tiên</w:t>
             </w:r>
           </w:p>
-        </w:tc>
-        <w:tc>
-          <w:tcPr>
-            <w:tcW w:w="1675" w:type="dxa"/>
+          <w:p>
+            <w:pPr>
+              <w:spacing w:after="60" w:line="300" w:lineRule="auto"/>
+              <w:rPr>
+                <w:b/>
+                <w:bCs/>
+                <w:lang w:val="en-US"/>
+              </w:rPr>
+            </w:pPr>
+            <w:r>
+              <w:rPr>
+                <w:b/>
+                <w:bCs/>
+                <w:sz w:val="22"/>
+                <w:szCs w:val="22"/>
+                <w:lang w:val="en-US"/>
+              </w:rPr>
+              <w:t>(</w:t>
+            </w:r>
+            <w:r>
+              <w:rPr>
+                <w:b/>
+                <w:bCs/>
+                <w:sz w:val="22"/>
+                <w:szCs w:val="22"/>
+              </w:rPr>
+              <w:t>Priority Queue – Heap</w:t>
+            </w:r>
+            <w:r>
+              <w:rPr>
+                <w:b/>
+                <w:bCs/>
+                <w:sz w:val="22"/>
+                <w:szCs w:val="22"/>
+                <w:lang w:val="en-US"/>
+              </w:rPr>
+              <w:t>)</w:t>
+            </w:r>
+          </w:p>
+        </w:tc>
+        <w:tc>
+          <w:tcPr>
+            <w:tcW w:w="1440" w:type="dxa"/>
             <w:tcMar>
               <w:top w:w="80" w:type="dxa"/>
               <w:left w:w="100" w:type="dxa"/>
@@ -2924,7 +3224,7 @@
         </w:tc>
         <w:tc>
           <w:tcPr>
-            <w:tcW w:w="4356" w:type="dxa"/>
+            <w:tcW w:w="3794" w:type="dxa"/>
             <w:tcMar>
               <w:top w:w="80" w:type="dxa"/>
               <w:left w:w="100" w:type="dxa"/>
@@ -2996,42 +3296,84 @@
         </w:tc>
       </w:tr>
       <w:tr>
-        <w:tblPrEx>
-          <w:tblCellMar>
-            <w:top w:w="0" w:type="dxa"/>
-            <w:bottom w:w="0" w:type="dxa"/>
-          </w:tblCellMar>
-        </w:tblPrEx>
         <w:trPr>
           <w:trHeight w:val="2088"/>
         </w:trPr>
         <w:tc>
           <w:tcPr>
-            <w:tcW w:w="1898" w:type="dxa"/>
-            <w:tcMar>
-              <w:top w:w="80" w:type="dxa"/>
-              <w:left w:w="100" w:type="dxa"/>
-              <w:bottom w:w="80" w:type="dxa"/>
-              <w:right w:w="100" w:type="dxa"/>
-            </w:tcMar>
-            <w:vAlign w:val="center"/>
-          </w:tcPr>
-          <w:p>
-            <w:pPr>
-              <w:spacing w:after="60" w:line="300" w:lineRule="auto"/>
-            </w:pPr>
-            <w:r>
-              <w:rPr>
+            <w:tcW w:w="2695" w:type="dxa"/>
+            <w:tcMar>
+              <w:top w:w="80" w:type="dxa"/>
+              <w:left w:w="100" w:type="dxa"/>
+              <w:bottom w:w="80" w:type="dxa"/>
+              <w:right w:w="100" w:type="dxa"/>
+            </w:tcMar>
+            <w:vAlign w:val="center"/>
+          </w:tcPr>
+          <w:p>
+            <w:pPr>
+              <w:spacing w:after="60" w:line="300" w:lineRule="auto"/>
+              <w:rPr>
+                <w:b/>
+                <w:bCs/>
+                <w:sz w:val="22"/>
+                <w:szCs w:val="22"/>
+                <w:lang w:val="en-US"/>
+              </w:rPr>
+            </w:pPr>
+            <w:r>
+              <w:rPr>
+                <w:b/>
+                <w:bCs/>
                 <w:sz w:val="22"/>
                 <w:szCs w:val="22"/>
               </w:rPr>
               <w:t>Cây tiền tố</w:t>
             </w:r>
           </w:p>
-        </w:tc>
-        <w:tc>
-          <w:tcPr>
-            <w:tcW w:w="1675" w:type="dxa"/>
+          <w:p>
+            <w:pPr>
+              <w:spacing w:after="60" w:line="300" w:lineRule="auto"/>
+              <w:rPr>
+                <w:b/>
+                <w:bCs/>
+                <w:lang w:val="en-US"/>
+              </w:rPr>
+            </w:pPr>
+            <w:r>
+              <w:rPr>
+                <w:b/>
+                <w:bCs/>
+                <w:sz w:val="22"/>
+                <w:szCs w:val="22"/>
+                <w:lang w:val="en-US"/>
+              </w:rPr>
+              <w:t>(</w:t>
+            </w:r>
+            <w:r>
+              <w:rPr>
+                <w:b/>
+                <w:bCs/>
+                <w:sz w:val="22"/>
+                <w:szCs w:val="22"/>
+              </w:rPr>
+              <w:t>Trie</w:t>
+            </w:r>
+            <w:r>
+              <w:rPr>
+                <w:b/>
+                <w:bCs/>
+                <w:sz w:val="22"/>
+                <w:szCs w:val="22"/>
+                <w:lang w:val="en-US"/>
+              </w:rPr>
+              <w:t>)</w:t>
+            </w:r>
+          </w:p>
+        </w:tc>
+        <w:tc>
+          <w:tcPr>
+            <w:tcW w:w="1440" w:type="dxa"/>
             <w:tcMar>
               <w:top w:w="80" w:type="dxa"/>
               <w:left w:w="100" w:type="dxa"/>
@@ -3055,7 +3397,7 @@
         </w:tc>
         <w:tc>
           <w:tcPr>
-            <w:tcW w:w="4356" w:type="dxa"/>
+            <w:tcW w:w="3794" w:type="dxa"/>
             <w:tcMar>
               <w:top w:w="80" w:type="dxa"/>
               <w:left w:w="100" w:type="dxa"/>
@@ -3127,42 +3469,84 @@
         </w:tc>
       </w:tr>
       <w:tr>
-        <w:tblPrEx>
-          <w:tblCellMar>
-            <w:top w:w="0" w:type="dxa"/>
-            <w:bottom w:w="0" w:type="dxa"/>
-          </w:tblCellMar>
-        </w:tblPrEx>
         <w:trPr>
           <w:trHeight w:val="691"/>
         </w:trPr>
         <w:tc>
           <w:tcPr>
-            <w:tcW w:w="1898" w:type="dxa"/>
-            <w:tcMar>
-              <w:top w:w="80" w:type="dxa"/>
-              <w:left w:w="100" w:type="dxa"/>
-              <w:bottom w:w="80" w:type="dxa"/>
-              <w:right w:w="100" w:type="dxa"/>
-            </w:tcMar>
-            <w:vAlign w:val="center"/>
-          </w:tcPr>
-          <w:p>
-            <w:pPr>
-              <w:spacing w:after="60" w:line="300" w:lineRule="auto"/>
-            </w:pPr>
-            <w:r>
-              <w:rPr>
+            <w:tcW w:w="2695" w:type="dxa"/>
+            <w:tcMar>
+              <w:top w:w="80" w:type="dxa"/>
+              <w:left w:w="100" w:type="dxa"/>
+              <w:bottom w:w="80" w:type="dxa"/>
+              <w:right w:w="100" w:type="dxa"/>
+            </w:tcMar>
+            <w:vAlign w:val="center"/>
+          </w:tcPr>
+          <w:p>
+            <w:pPr>
+              <w:spacing w:after="60" w:line="300" w:lineRule="auto"/>
+              <w:rPr>
+                <w:b/>
+                <w:bCs/>
+                <w:sz w:val="22"/>
+                <w:szCs w:val="22"/>
+                <w:lang w:val="en-US"/>
+              </w:rPr>
+            </w:pPr>
+            <w:r>
+              <w:rPr>
+                <w:b/>
+                <w:bCs/>
                 <w:sz w:val="22"/>
                 <w:szCs w:val="22"/>
               </w:rPr>
               <w:t>Bảng băm tra cứu</w:t>
             </w:r>
           </w:p>
-        </w:tc>
-        <w:tc>
-          <w:tcPr>
-            <w:tcW w:w="1675" w:type="dxa"/>
+          <w:p>
+            <w:pPr>
+              <w:spacing w:after="60" w:line="300" w:lineRule="auto"/>
+              <w:rPr>
+                <w:b/>
+                <w:bCs/>
+                <w:lang w:val="en-US"/>
+              </w:rPr>
+            </w:pPr>
+            <w:r>
+              <w:rPr>
+                <w:b/>
+                <w:bCs/>
+                <w:sz w:val="22"/>
+                <w:szCs w:val="22"/>
+                <w:lang w:val="en-US"/>
+              </w:rPr>
+              <w:t>(</w:t>
+            </w:r>
+            <w:r>
+              <w:rPr>
+                <w:b/>
+                <w:bCs/>
+                <w:sz w:val="22"/>
+                <w:szCs w:val="22"/>
+              </w:rPr>
+              <w:t>Hash Table</w:t>
+            </w:r>
+            <w:r>
+              <w:rPr>
+                <w:b/>
+                <w:bCs/>
+                <w:sz w:val="22"/>
+                <w:szCs w:val="22"/>
+                <w:lang w:val="en-US"/>
+              </w:rPr>
+              <w:t>)</w:t>
+            </w:r>
+          </w:p>
+        </w:tc>
+        <w:tc>
+          <w:tcPr>
+            <w:tcW w:w="1440" w:type="dxa"/>
             <w:tcMar>
               <w:top w:w="80" w:type="dxa"/>
               <w:left w:w="100" w:type="dxa"/>
@@ -3186,7 +3570,7 @@
         </w:tc>
         <w:tc>
           <w:tcPr>
-            <w:tcW w:w="4356" w:type="dxa"/>
+            <w:tcW w:w="3794" w:type="dxa"/>
             <w:tcMar>
               <w:top w:w="80" w:type="dxa"/>
               <w:left w:w="100" w:type="dxa"/>
@@ -3234,42 +3618,178 @@
         </w:tc>
       </w:tr>
       <w:tr>
-        <w:tblPrEx>
-          <w:tblCellMar>
-            <w:top w:w="0" w:type="dxa"/>
-            <w:bottom w:w="0" w:type="dxa"/>
-          </w:tblCellMar>
-        </w:tblPrEx>
         <w:trPr>
           <w:trHeight w:val="2105"/>
         </w:trPr>
         <w:tc>
           <w:tcPr>
-            <w:tcW w:w="1898" w:type="dxa"/>
-            <w:tcMar>
-              <w:top w:w="80" w:type="dxa"/>
-              <w:left w:w="100" w:type="dxa"/>
-              <w:bottom w:w="80" w:type="dxa"/>
-              <w:right w:w="100" w:type="dxa"/>
-            </w:tcMar>
-            <w:vAlign w:val="center"/>
-          </w:tcPr>
-          <w:p>
-            <w:pPr>
-              <w:spacing w:after="60" w:line="300" w:lineRule="auto"/>
-            </w:pPr>
-            <w:r>
-              <w:rPr>
+            <w:tcW w:w="2695" w:type="dxa"/>
+            <w:tcMar>
+              <w:top w:w="80" w:type="dxa"/>
+              <w:left w:w="100" w:type="dxa"/>
+              <w:bottom w:w="80" w:type="dxa"/>
+              <w:right w:w="100" w:type="dxa"/>
+            </w:tcMar>
+            <w:vAlign w:val="center"/>
+          </w:tcPr>
+          <w:p>
+            <w:pPr>
+              <w:spacing w:after="60" w:line="300" w:lineRule="auto"/>
+              <w:rPr>
+                <w:b/>
+                <w:bCs/>
+                <w:sz w:val="22"/>
+                <w:szCs w:val="22"/>
+                <w:lang w:val="en-US"/>
+              </w:rPr>
+            </w:pPr>
+            <w:r>
+              <w:rPr>
+                <w:b/>
+                <w:bCs/>
                 <w:sz w:val="22"/>
                 <w:szCs w:val="22"/>
               </w:rPr>
               <w:t>Danh sách liên kết đôi giới hạn kích thước</w:t>
             </w:r>
           </w:p>
-        </w:tc>
-        <w:tc>
-          <w:tcPr>
-            <w:tcW w:w="1675" w:type="dxa"/>
+          <w:tbl>
+            <w:tblPr>
+              <w:tblW w:w="0" w:type="auto"/>
+              <w:tblCellSpacing w:w="15" w:type="dxa"/>
+              <w:tblCellMar>
+                <w:top w:w="15" w:type="dxa"/>
+                <w:left w:w="15" w:type="dxa"/>
+                <w:bottom w:w="15" w:type="dxa"/>
+                <w:right w:w="15" w:type="dxa"/>
+              </w:tblCellMar>
+              <w:tblLook w:val="04A0" w:firstRow="1" w:lastRow="0" w:firstColumn="1" w:lastColumn="0" w:noHBand="0" w:noVBand="1"/>
+            </w:tblPr>
+            <w:tblGrid>
+              <w:gridCol w:w="2071"/>
+            </w:tblGrid>
+            <w:tr>
+              <w:trPr>
+                <w:tblCellSpacing w:w="15" w:type="dxa"/>
+              </w:trPr>
+              <w:tc>
+                <w:tcPr>
+                  <w:tcW w:w="0" w:type="auto"/>
+                  <w:vAlign w:val="center"/>
+                  <w:hideMark/>
+                </w:tcPr>
+                <w:p>
+                  <w:pPr>
+                    <w:spacing w:after="60" w:line="300" w:lineRule="auto"/>
+                    <w:rPr>
+                      <w:b/>
+                      <w:bCs/>
+                      <w:sz w:val="22"/>
+                      <w:szCs w:val="22"/>
+                      <w:lang w:val="en-US"/>
+                    </w:rPr>
+                  </w:pPr>
+                  <w:r>
+                    <w:rPr>
+                      <w:b/>
+                      <w:bCs/>
+                      <w:sz w:val="22"/>
+                      <w:szCs w:val="22"/>
+                      <w:lang w:val="en-US"/>
+                    </w:rPr>
+                    <w:t>(</w:t>
+                  </w:r>
+                  <w:r>
+                    <w:rPr>
+                      <w:b/>
+                      <w:bCs/>
+                      <w:sz w:val="22"/>
+                      <w:szCs w:val="22"/>
+                      <w:lang w:val="en-US"/>
+                    </w:rPr>
+                    <w:t>Doubly Linked List</w:t>
+                  </w:r>
+                  <w:r>
+                    <w:rPr>
+                      <w:b/>
+                      <w:bCs/>
+                      <w:sz w:val="22"/>
+                      <w:szCs w:val="22"/>
+                      <w:lang w:val="en-US"/>
+                    </w:rPr>
+                    <w:t>)</w:t>
+                  </w:r>
+                </w:p>
+              </w:tc>
+            </w:tr>
+          </w:tbl>
+          <w:p>
+            <w:pPr>
+              <w:spacing w:after="60" w:line="300" w:lineRule="auto"/>
+              <w:rPr>
+                <w:b/>
+                <w:bCs/>
+                <w:vanish/>
+                <w:sz w:val="22"/>
+                <w:szCs w:val="22"/>
+                <w:lang w:val="en-US"/>
+              </w:rPr>
+            </w:pPr>
+          </w:p>
+          <w:tbl>
+            <w:tblPr>
+              <w:tblW w:w="0" w:type="auto"/>
+              <w:tblCellSpacing w:w="15" w:type="dxa"/>
+              <w:tblCellMar>
+                <w:top w:w="15" w:type="dxa"/>
+                <w:left w:w="15" w:type="dxa"/>
+                <w:bottom w:w="15" w:type="dxa"/>
+                <w:right w:w="15" w:type="dxa"/>
+              </w:tblCellMar>
+              <w:tblLook w:val="04A0" w:firstRow="1" w:lastRow="0" w:firstColumn="1" w:lastColumn="0" w:noHBand="0" w:noVBand="1"/>
+            </w:tblPr>
+            <w:tblGrid>
+              <w:gridCol w:w="96"/>
+            </w:tblGrid>
+            <w:tr>
+              <w:trPr>
+                <w:tblCellSpacing w:w="15" w:type="dxa"/>
+              </w:trPr>
+              <w:tc>
+                <w:tcPr>
+                  <w:tcW w:w="0" w:type="auto"/>
+                  <w:vAlign w:val="center"/>
+                  <w:hideMark/>
+                </w:tcPr>
+                <w:p>
+                  <w:pPr>
+                    <w:spacing w:after="60" w:line="300" w:lineRule="auto"/>
+                    <w:rPr>
+                      <w:b/>
+                      <w:bCs/>
+                      <w:sz w:val="22"/>
+                      <w:szCs w:val="22"/>
+                      <w:lang w:val="en-US"/>
+                    </w:rPr>
+                  </w:pPr>
+                </w:p>
+              </w:tc>
+            </w:tr>
+          </w:tbl>
+          <w:p>
+            <w:pPr>
+              <w:spacing w:after="60" w:line="300" w:lineRule="auto"/>
+              <w:rPr>
+                <w:b/>
+                <w:bCs/>
+                <w:lang w:val="en-US"/>
+              </w:rPr>
+            </w:pPr>
+          </w:p>
+        </w:tc>
+        <w:tc>
+          <w:tcPr>
+            <w:tcW w:w="1440" w:type="dxa"/>
             <w:tcMar>
               <w:top w:w="80" w:type="dxa"/>
               <w:left w:w="100" w:type="dxa"/>
@@ -3293,7 +3813,7 @@
         </w:tc>
         <w:tc>
           <w:tcPr>
-            <w:tcW w:w="4356" w:type="dxa"/>
+            <w:tcW w:w="3794" w:type="dxa"/>
             <w:tcMar>
               <w:top w:w="80" w:type="dxa"/>
               <w:left w:w="100" w:type="dxa"/>
@@ -3365,21 +3885,6 @@
         </w:tc>
       </w:tr>
     </w:tbl>
-    <w:p>
-      <w:pPr>
-        <w:spacing w:after="160" w:line="360" w:lineRule="auto"/>
-        <w:jc w:val="both"/>
-      </w:pPr>
-    </w:p>
-    <w:p>
-      <w:pPr>
-        <w:spacing w:after="160" w:line="360" w:lineRule="auto"/>
-        <w:jc w:val="both"/>
-      </w:pPr>
-      <w:r>
-        <w:t>Cột người phụ trách sẽ được điền cụ thể khi nhóm họp phân công vai trò, bảo đảm mỗi thành viên sở hữu ít nhất một thành phần kỹ thuật thực chất và một phần lập luận đã phân tích theo Mục 2, đúng yêu cầu về đóng góp cá nhân của đề bài.</w:t>
-      </w:r>
-    </w:p>
     <w:p>
       <w:pPr>
         <w:pStyle w:val="Heading2"/>
@@ -3399,6 +3904,7 @@
     <w:p>
       <w:pPr>
         <w:spacing w:after="160" w:line="360" w:lineRule="auto"/>
+        <w:ind w:firstLine="720"/>
         <w:jc w:val="both"/>
       </w:pPr>
       <w:r>
@@ -3416,17 +3922,21 @@
           <w:bCs/>
           <w:color w:val="000000"/>
         </w:rPr>
+        <w:t>6. Kế hoạch đo hiệu năng</w:t>
+      </w:r>
+    </w:p>
+    <w:p>
+      <w:pPr>
+        <w:spacing w:after="160" w:line="360" w:lineRule="auto"/>
+        <w:ind w:firstLine="720"/>
+        <w:jc w:val="both"/>
+      </w:pPr>
+      <w:r>
+        <w:t xml:space="preserve">Đề bài yêu cầu bằng chứng thực nghiệm cho thấy giải pháp hoạt động đúng như phân tích độ phức tạp dự đoán, ở quy mô đủ lớn để thấy rõ khác biệt so với cách quét tuyến tính đơn giản. Nhóm đề xuất quy mô giả lập tối thiểu là mười nghìn sản phẩm và </w:t>
+      </w:r>
+      <w:r>
         <w:lastRenderedPageBreak/>
-        <w:t>6. Kế hoạch đo hiệu năng</w:t>
-      </w:r>
-    </w:p>
-    <w:p>
-      <w:pPr>
-        <w:spacing w:after="160" w:line="360" w:lineRule="auto"/>
-        <w:jc w:val="both"/>
-      </w:pPr>
-      <w:r>
-        <w:t>Đề bài yêu cầu bằng chứng thực nghiệm cho thấy giải pháp hoạt động đúng như phân tích độ phức tạp dự đoán, ở quy mô đủ lớn để thấy rõ khác biệt so với cách quét tuyến tính đơn giản. Nhóm đề xuất quy mô giả lập tối thiểu là mười nghìn sản phẩm và mười nghìn đơn hàng, đo tại hai mốc quy mô cách nhau ít nhất một bậc, ví dụ một nghìn bản ghi và mười nghìn bản ghi, để thấy rõ xu hướng thời gian xử lý.</w:t>
+        <w:t>mười nghìn đơn hàng, đo tại hai mốc quy mô cách nhau ít nhất một bậc, ví dụ một nghìn bản ghi và mười nghìn bản ghi, để thấy rõ xu hướng thời gian xử lý.</w:t>
       </w:r>
     </w:p>
     <w:tbl>
@@ -3452,12 +3962,6 @@
         <w:gridCol w:w="3400"/>
       </w:tblGrid>
       <w:tr>
-        <w:tblPrEx>
-          <w:tblCellMar>
-            <w:top w:w="0" w:type="dxa"/>
-            <w:bottom w:w="0" w:type="dxa"/>
-          </w:tblCellMar>
-        </w:tblPrEx>
         <w:trPr>
           <w:tblHeader/>
         </w:trPr>
@@ -3541,12 +4045,6 @@
         </w:tc>
       </w:tr>
       <w:tr>
-        <w:tblPrEx>
-          <w:tblCellMar>
-            <w:top w:w="0" w:type="dxa"/>
-            <w:bottom w:w="0" w:type="dxa"/>
-          </w:tblCellMar>
-        </w:tblPrEx>
         <w:tc>
           <w:tcPr>
             <w:tcW w:w="1600" w:type="dxa"/>
@@ -3621,12 +4119,6 @@
         </w:tc>
       </w:tr>
       <w:tr>
-        <w:tblPrEx>
-          <w:tblCellMar>
-            <w:top w:w="0" w:type="dxa"/>
-            <w:bottom w:w="0" w:type="dxa"/>
-          </w:tblCellMar>
-        </w:tblPrEx>
         <w:tc>
           <w:tcPr>
             <w:tcW w:w="1600" w:type="dxa"/>
@@ -3701,12 +4193,6 @@
         </w:tc>
       </w:tr>
       <w:tr>
-        <w:tblPrEx>
-          <w:tblCellMar>
-            <w:top w:w="0" w:type="dxa"/>
-            <w:bottom w:w="0" w:type="dxa"/>
-          </w:tblCellMar>
-        </w:tblPrEx>
         <w:tc>
           <w:tcPr>
             <w:tcW w:w="1600" w:type="dxa"/>
@@ -3781,12 +4267,6 @@
         </w:tc>
       </w:tr>
       <w:tr>
-        <w:tblPrEx>
-          <w:tblCellMar>
-            <w:top w:w="0" w:type="dxa"/>
-            <w:bottom w:w="0" w:type="dxa"/>
-          </w:tblCellMar>
-        </w:tblPrEx>
         <w:tc>
           <w:tcPr>
             <w:tcW w:w="1600" w:type="dxa"/>
@@ -3861,12 +4341,6 @@
         </w:tc>
       </w:tr>
     </w:tbl>
-    <w:p>
-      <w:pPr>
-        <w:spacing w:after="160" w:line="360" w:lineRule="auto"/>
-        <w:jc w:val="both"/>
-      </w:pPr>
-    </w:p>
     <w:p>
       <w:pPr>
         <w:spacing w:after="160" w:line="360" w:lineRule="auto"/>
@@ -3893,6 +4367,7 @@
     <w:p>
       <w:pPr>
         <w:spacing w:after="160" w:line="360" w:lineRule="auto"/>
+        <w:ind w:firstLine="720"/>
         <w:jc w:val="both"/>
       </w:pPr>
       <w:r>
@@ -3924,7 +4399,6 @@
         <w:jc w:val="both"/>
       </w:pPr>
       <w:r>
-        <w:lastRenderedPageBreak/>
         <w:t>Kết quả gợi ý theo đoạn đầu ký tự khi nhân viên gõ mã hoặc tên sản phẩm, minh họa trực tiếp cây tiền tố đang hoạt động.</w:t>
       </w:r>
     </w:p>
@@ -3953,6 +4427,7 @@
         <w:jc w:val="both"/>
       </w:pPr>
       <w:r>
+        <w:lastRenderedPageBreak/>
         <w:t>Biểu đồ so sánh thời gian xử lý giữa cấu trúc đã chọn và cách quét tuyến tính, lấy trực tiếp từ số liệu đo ở Mục 6.</w:t>
       </w:r>
     </w:p>
@@ -3982,6 +4457,7 @@
     <w:p>
       <w:pPr>
         <w:spacing w:after="160" w:line="360" w:lineRule="auto"/>
+        <w:ind w:firstLine="720"/>
         <w:jc w:val="both"/>
       </w:pPr>
       <w:r>
@@ -4011,12 +4487,6 @@
         <w:gridCol w:w="2500"/>
       </w:tblGrid>
       <w:tr>
-        <w:tblPrEx>
-          <w:tblCellMar>
-            <w:top w:w="0" w:type="dxa"/>
-            <w:bottom w:w="0" w:type="dxa"/>
-          </w:tblCellMar>
-        </w:tblPrEx>
         <w:trPr>
           <w:tblHeader/>
         </w:trPr>
@@ -4100,12 +4570,6 @@
         </w:tc>
       </w:tr>
       <w:tr>
-        <w:tblPrEx>
-          <w:tblCellMar>
-            <w:top w:w="0" w:type="dxa"/>
-            <w:bottom w:w="0" w:type="dxa"/>
-          </w:tblCellMar>
-        </w:tblPrEx>
         <w:tc>
           <w:tcPr>
             <w:tcW w:w="1900" w:type="dxa"/>
@@ -4180,12 +4644,6 @@
         </w:tc>
       </w:tr>
       <w:tr>
-        <w:tblPrEx>
-          <w:tblCellMar>
-            <w:top w:w="0" w:type="dxa"/>
-            <w:bottom w:w="0" w:type="dxa"/>
-          </w:tblCellMar>
-        </w:tblPrEx>
         <w:tc>
           <w:tcPr>
             <w:tcW w:w="1900" w:type="dxa"/>
@@ -4260,12 +4718,6 @@
         </w:tc>
       </w:tr>
       <w:tr>
-        <w:tblPrEx>
-          <w:tblCellMar>
-            <w:top w:w="0" w:type="dxa"/>
-            <w:bottom w:w="0" w:type="dxa"/>
-          </w:tblCellMar>
-        </w:tblPrEx>
         <w:tc>
           <w:tcPr>
             <w:tcW w:w="1900" w:type="dxa"/>
@@ -4340,12 +4792,6 @@
         </w:tc>
       </w:tr>
       <w:tr>
-        <w:tblPrEx>
-          <w:tblCellMar>
-            <w:top w:w="0" w:type="dxa"/>
-            <w:bottom w:w="0" w:type="dxa"/>
-          </w:tblCellMar>
-        </w:tblPrEx>
         <w:tc>
           <w:tcPr>
             <w:tcW w:w="1900" w:type="dxa"/>
@@ -4420,12 +4866,6 @@
         </w:tc>
       </w:tr>
       <w:tr>
-        <w:tblPrEx>
-          <w:tblCellMar>
-            <w:top w:w="0" w:type="dxa"/>
-            <w:bottom w:w="0" w:type="dxa"/>
-          </w:tblCellMar>
-        </w:tblPrEx>
         <w:tc>
           <w:tcPr>
             <w:tcW w:w="1900" w:type="dxa"/>
@@ -4446,7 +4886,6 @@
                 <w:sz w:val="22"/>
                 <w:szCs w:val="22"/>
               </w:rPr>
-              <w:lastRenderedPageBreak/>
               <w:t>Phụ trách trực quan hóa web và đo hiệu năng</w:t>
             </w:r>
           </w:p>
@@ -4510,9 +4949,11 @@
     <w:p>
       <w:pPr>
         <w:spacing w:after="160" w:line="360" w:lineRule="auto"/>
+        <w:ind w:firstLine="720"/>
         <w:jc w:val="both"/>
       </w:pPr>
       <w:r>
+        <w:lastRenderedPageBreak/>
         <w:t>Nhóm họp định kỳ mỗi tuần một lần, ghi chép ngắn gọn nội dung họp và cập nhật tiến độ trên hệ thống quản lý phiên bản, dùng làm bằng chứng đóng góp cá nhân theo đúng yêu cầu của đề bài. Mỗi thành viên, dù đảm nhiệm vai trò nào, đều cần có khả năng giải thích thiết kế tổng thể của toàn bộ hệ thống trong buổi bảo vệ, không chỉ phần việc của riêng mình.</w:t>
       </w:r>
     </w:p>
@@ -4553,12 +4994,6 @@
         <w:gridCol w:w="2600"/>
       </w:tblGrid>
       <w:tr>
-        <w:tblPrEx>
-          <w:tblCellMar>
-            <w:top w:w="0" w:type="dxa"/>
-            <w:bottom w:w="0" w:type="dxa"/>
-          </w:tblCellMar>
-        </w:tblPrEx>
         <w:trPr>
           <w:tblHeader/>
         </w:trPr>
@@ -4642,12 +5077,6 @@
         </w:tc>
       </w:tr>
       <w:tr>
-        <w:tblPrEx>
-          <w:tblCellMar>
-            <w:top w:w="0" w:type="dxa"/>
-            <w:bottom w:w="0" w:type="dxa"/>
-          </w:tblCellMar>
-        </w:tblPrEx>
         <w:tc>
           <w:tcPr>
             <w:tcW w:w="1800" w:type="dxa"/>
@@ -4722,12 +5151,6 @@
         </w:tc>
       </w:tr>
       <w:tr>
-        <w:tblPrEx>
-          <w:tblCellMar>
-            <w:top w:w="0" w:type="dxa"/>
-            <w:bottom w:w="0" w:type="dxa"/>
-          </w:tblCellMar>
-        </w:tblPrEx>
         <w:tc>
           <w:tcPr>
             <w:tcW w:w="1800" w:type="dxa"/>
@@ -4802,12 +5225,6 @@
         </w:tc>
       </w:tr>
       <w:tr>
-        <w:tblPrEx>
-          <w:tblCellMar>
-            <w:top w:w="0" w:type="dxa"/>
-            <w:bottom w:w="0" w:type="dxa"/>
-          </w:tblCellMar>
-        </w:tblPrEx>
         <w:tc>
           <w:tcPr>
             <w:tcW w:w="1800" w:type="dxa"/>
@@ -4882,12 +5299,6 @@
         </w:tc>
       </w:tr>
       <w:tr>
-        <w:tblPrEx>
-          <w:tblCellMar>
-            <w:top w:w="0" w:type="dxa"/>
-            <w:bottom w:w="0" w:type="dxa"/>
-          </w:tblCellMar>
-        </w:tblPrEx>
         <w:tc>
           <w:tcPr>
             <w:tcW w:w="1800" w:type="dxa"/>
@@ -4962,12 +5373,6 @@
         </w:tc>
       </w:tr>
       <w:tr>
-        <w:tblPrEx>
-          <w:tblCellMar>
-            <w:top w:w="0" w:type="dxa"/>
-            <w:bottom w:w="0" w:type="dxa"/>
-          </w:tblCellMar>
-        </w:tblPrEx>
         <w:tc>
           <w:tcPr>
             <w:tcW w:w="1800" w:type="dxa"/>
@@ -5042,12 +5447,6 @@
         </w:tc>
       </w:tr>
       <w:tr>
-        <w:tblPrEx>
-          <w:tblCellMar>
-            <w:top w:w="0" w:type="dxa"/>
-            <w:bottom w:w="0" w:type="dxa"/>
-          </w:tblCellMar>
-        </w:tblPrEx>
         <w:tc>
           <w:tcPr>
             <w:tcW w:w="1800" w:type="dxa"/>
@@ -5116,15 +5515,7 @@
                 <w:sz w:val="22"/>
                 <w:szCs w:val="22"/>
               </w:rPr>
-              <w:t xml:space="preserve">Số liệu hiệu năng, demo hoàn chỉnh, mỗi thành </w:t>
-            </w:r>
-            <w:r>
-              <w:rPr>
-                <w:sz w:val="22"/>
-                <w:szCs w:val="22"/>
-              </w:rPr>
-              <w:lastRenderedPageBreak/>
-              <w:t>viên sẵn sàng bảo vệ phần việc và hiểu toàn hệ thống.</w:t>
+              <w:t>Số liệu hiệu năng, demo hoàn chỉnh, mỗi thành viên sẵn sàng bảo vệ phần việc và hiểu toàn hệ thống.</w:t>
             </w:r>
           </w:p>
         </w:tc>
@@ -5170,6 +5561,7 @@
         <w:jc w:val="both"/>
       </w:pPr>
       <w:r>
+        <w:lastRenderedPageBreak/>
         <w:t>Không nêu tên cấu trúc dữ liệu trước khi hoàn thành phân tích theo quy trình bốn bước cho từng yêu cầu.</w:t>
       </w:r>
     </w:p>
@@ -5328,7 +5720,6 @@
         <w:jc w:val="both"/>
       </w:pPr>
       <w:r>
-        <w:lastRenderedPageBreak/>
         <w:t>MC1, MC2, TP1, TP2, TP3 đều hoạt động đúng.</w:t>
       </w:r>
     </w:p>
@@ -5429,6 +5820,7 @@
           <w:sz w:val="26"/>
           <w:szCs w:val="26"/>
         </w:rPr>
+        <w:lastRenderedPageBreak/>
         <w:t>Giai đoạn Design chính thức</w:t>
       </w:r>
     </w:p>
@@ -5575,33 +5967,644 @@
       </w:r>
     </w:p>
     <w:p>
-      <w:r>
-        <w:br w:type="page"/>
-      </w:r>
-    </w:p>
-    <w:p>
-      <w:pPr>
-        <w:pStyle w:val="Heading1"/>
-        <w:spacing w:before="400" w:after="200"/>
-      </w:pPr>
-      <w:r>
+      <w:pPr>
         <w:rPr>
           <w:b/>
           <w:bCs/>
-          <w:color w:val="000000"/>
+          <w:sz w:val="32"/>
+          <w:szCs w:val="32"/>
+          <w:lang w:val="en-US"/>
+        </w:rPr>
+      </w:pPr>
+      <w:r>
+        <w:rPr>
+          <w:b/>
+          <w:bCs/>
+          <w:sz w:val="32"/>
+          <w:szCs w:val="32"/>
+          <w:lang w:val="en-US"/>
+        </w:rPr>
+        <w:br w:type="page"/>
+      </w:r>
+    </w:p>
+    <w:p>
+      <w:pPr>
+        <w:spacing w:after="100" w:line="360" w:lineRule="auto"/>
+        <w:ind w:left="240"/>
+        <w:jc w:val="both"/>
+        <w:rPr>
+          <w:b/>
+          <w:bCs/>
+          <w:sz w:val="32"/>
+          <w:szCs w:val="32"/>
+          <w:lang w:val="en-US"/>
+        </w:rPr>
+      </w:pPr>
+      <w:r>
+        <w:rPr>
+          <w:b/>
+          <w:bCs/>
+          <w:sz w:val="32"/>
+          <w:szCs w:val="32"/>
+          <w:lang w:val="en-US"/>
         </w:rPr>
         <w:lastRenderedPageBreak/>
-        <w:t>12. Tổng kết</w:t>
-      </w:r>
-    </w:p>
-    <w:p>
-      <w:pPr>
-        <w:spacing w:after="160" w:line="360" w:lineRule="auto"/>
+        <w:t xml:space="preserve">12. </w:t>
+      </w:r>
+      <w:r>
+        <w:rPr>
+          <w:b/>
+          <w:bCs/>
+          <w:sz w:val="32"/>
+          <w:szCs w:val="32"/>
+          <w:lang w:val="en-US"/>
+        </w:rPr>
+        <w:t>Bảng p</w:t>
+      </w:r>
+      <w:r>
+        <w:rPr>
+          <w:b/>
+          <w:bCs/>
+          <w:sz w:val="32"/>
+          <w:szCs w:val="32"/>
+          <w:lang w:val="en-US"/>
+        </w:rPr>
+        <w:t>hân công cụ thể</w:t>
+      </w:r>
+    </w:p>
+    <w:p>
+      <w:pPr>
+        <w:spacing w:after="100" w:line="360" w:lineRule="auto"/>
+        <w:ind w:left="240"/>
         <w:jc w:val="both"/>
-      </w:pPr>
-      <w:r>
-        <w:t>Kế hoạch trên bám sát toàn bộ yêu cầu của đề bài: không chọn cấu trúc trước khi phân tích, có đầy đủ hai yêu cầu bắt buộc và ba yêu cầu tự phát hiện thực sự khác biệt, có một xung đột yêu cầu thật sự được giải quyết bằng cách kết hợp cấu trúc, có kiến trúc ba tầng rõ ràng, có kế hoạch đo hiệu năng thực nghiệm cụ thể, và có phân công vai trò bảo đảm mỗi thành viên đều có đóng góp kỹ thuật lẫn lập luận thiết kế. Đây là bản kế hoạch làm việc, các con số và lựa chọn cụ thể có thể được điều chỉnh trong quá trình thực hiện khi nhóm hiểu sâu hơn về bài toán, miễn là mọi điều chỉnh đều đi kèm lập luận rõ ràng như tinh thần chung của đề bài.</w:t>
-      </w:r>
+        <w:rPr>
+          <w:b/>
+          <w:bCs/>
+          <w:sz w:val="32"/>
+          <w:szCs w:val="32"/>
+          <w:lang w:val="en-US"/>
+        </w:rPr>
+      </w:pPr>
+      <w:r>
+        <w:rPr>
+          <w:b/>
+          <w:bCs/>
+          <w:sz w:val="32"/>
+          <w:szCs w:val="32"/>
+          <w:lang w:val="en-US"/>
+        </w:rPr>
+        <w:t>Bảng phân chia công việc nhóm 5 người</w:t>
+      </w:r>
+    </w:p>
+    <w:tbl>
+      <w:tblPr>
+        <w:tblStyle w:val="TableGridLight"/>
+        <w:tblW w:w="9985" w:type="dxa"/>
+        <w:tblLook w:val="04A0" w:firstRow="1" w:lastRow="0" w:firstColumn="1" w:lastColumn="0" w:noHBand="0" w:noVBand="1"/>
+      </w:tblPr>
+      <w:tblGrid>
+        <w:gridCol w:w="2695"/>
+        <w:gridCol w:w="2520"/>
+        <w:gridCol w:w="2160"/>
+        <w:gridCol w:w="2610"/>
+      </w:tblGrid>
+      <w:tr>
+        <w:tc>
+          <w:tcPr>
+            <w:tcW w:w="2695" w:type="dxa"/>
+            <w:vAlign w:val="center"/>
+            <w:hideMark/>
+          </w:tcPr>
+          <w:p>
+            <w:pPr>
+              <w:rPr>
+                <w:b/>
+                <w:bCs/>
+                <w:lang w:val="en-US"/>
+              </w:rPr>
+            </w:pPr>
+            <w:r>
+              <w:rPr>
+                <w:b/>
+                <w:bCs/>
+                <w:lang w:val="en-US"/>
+              </w:rPr>
+              <w:t>Thành viên</w:t>
+            </w:r>
+          </w:p>
+        </w:tc>
+        <w:tc>
+          <w:tcPr>
+            <w:tcW w:w="2520" w:type="dxa"/>
+            <w:vAlign w:val="center"/>
+            <w:hideMark/>
+          </w:tcPr>
+          <w:p>
+            <w:pPr>
+              <w:rPr>
+                <w:b/>
+                <w:bCs/>
+                <w:lang w:val="en-US"/>
+              </w:rPr>
+            </w:pPr>
+            <w:r>
+              <w:rPr>
+                <w:b/>
+                <w:bCs/>
+                <w:lang w:val="en-US"/>
+              </w:rPr>
+              <w:t>Phần phụ trách chính</w:t>
+            </w:r>
+          </w:p>
+        </w:tc>
+        <w:tc>
+          <w:tcPr>
+            <w:tcW w:w="2160" w:type="dxa"/>
+            <w:vAlign w:val="center"/>
+            <w:hideMark/>
+          </w:tcPr>
+          <w:p>
+            <w:pPr>
+              <w:rPr>
+                <w:b/>
+                <w:bCs/>
+                <w:lang w:val="en-US"/>
+              </w:rPr>
+            </w:pPr>
+            <w:r>
+              <w:rPr>
+                <w:b/>
+                <w:bCs/>
+                <w:lang w:val="en-US"/>
+              </w:rPr>
+              <w:t>Cấu trúc dữ liệu / Giải thuật</w:t>
+            </w:r>
+          </w:p>
+        </w:tc>
+        <w:tc>
+          <w:tcPr>
+            <w:tcW w:w="2610" w:type="dxa"/>
+            <w:vAlign w:val="center"/>
+            <w:hideMark/>
+          </w:tcPr>
+          <w:p>
+            <w:pPr>
+              <w:rPr>
+                <w:b/>
+                <w:bCs/>
+                <w:lang w:val="en-US"/>
+              </w:rPr>
+            </w:pPr>
+            <w:r>
+              <w:rPr>
+                <w:b/>
+                <w:bCs/>
+                <w:lang w:val="en-US"/>
+              </w:rPr>
+              <w:t>Công việc phụ</w:t>
+            </w:r>
+          </w:p>
+        </w:tc>
+      </w:tr>
+      <w:tr>
+        <w:trPr>
+          <w:trHeight w:val="1313"/>
+        </w:trPr>
+        <w:tc>
+          <w:tcPr>
+            <w:tcW w:w="2695" w:type="dxa"/>
+            <w:vAlign w:val="center"/>
+            <w:hideMark/>
+          </w:tcPr>
+          <w:p>
+            <w:pPr>
+              <w:rPr>
+                <w:lang w:val="en-US"/>
+              </w:rPr>
+            </w:pPr>
+            <w:r>
+              <w:rPr>
+                <w:lang w:val="en-US"/>
+              </w:rPr>
+              <w:t>Hồ Nhật Minh</w:t>
+            </w:r>
+          </w:p>
+        </w:tc>
+        <w:tc>
+          <w:tcPr>
+            <w:tcW w:w="2520" w:type="dxa"/>
+            <w:vAlign w:val="center"/>
+            <w:hideMark/>
+          </w:tcPr>
+          <w:p>
+            <w:pPr>
+              <w:rPr>
+                <w:lang w:val="en-US"/>
+              </w:rPr>
+            </w:pPr>
+            <w:r>
+              <w:rPr>
+                <w:lang w:val="en-US"/>
+              </w:rPr>
+              <w:t>Xử lý đơn hàng ưu tiên – MC2 + TP1</w:t>
+            </w:r>
+          </w:p>
+        </w:tc>
+        <w:tc>
+          <w:tcPr>
+            <w:tcW w:w="2160" w:type="dxa"/>
+            <w:vAlign w:val="center"/>
+            <w:hideMark/>
+          </w:tcPr>
+          <w:p>
+            <w:pPr>
+              <w:rPr>
+                <w:lang w:val="en-US"/>
+              </w:rPr>
+            </w:pPr>
+            <w:r>
+              <w:rPr>
+                <w:lang w:val="en-US"/>
+              </w:rPr>
+              <w:t>Heap / Priority Queue</w:t>
+            </w:r>
+          </w:p>
+        </w:tc>
+        <w:tc>
+          <w:tcPr>
+            <w:tcW w:w="2610" w:type="dxa"/>
+            <w:vAlign w:val="center"/>
+            <w:hideMark/>
+          </w:tcPr>
+          <w:p>
+            <w:pPr>
+              <w:rPr>
+                <w:lang w:val="en-US"/>
+              </w:rPr>
+            </w:pPr>
+            <w:r>
+              <w:rPr>
+                <w:lang w:val="en-US"/>
+              </w:rPr>
+              <w:t>Phân tích xung đột ưu tiên và thứ tự đến trước</w:t>
+            </w:r>
+          </w:p>
+        </w:tc>
+      </w:tr>
+      <w:tr>
+        <w:trPr>
+          <w:trHeight w:val="1079"/>
+        </w:trPr>
+        <w:tc>
+          <w:tcPr>
+            <w:tcW w:w="2695" w:type="dxa"/>
+            <w:vAlign w:val="center"/>
+            <w:hideMark/>
+          </w:tcPr>
+          <w:p>
+            <w:pPr>
+              <w:rPr>
+                <w:lang w:val="en-US"/>
+              </w:rPr>
+            </w:pPr>
+            <w:r>
+              <w:rPr>
+                <w:lang w:val="en-US"/>
+              </w:rPr>
+              <w:t>Dương Thị Kim Ngân</w:t>
+            </w:r>
+          </w:p>
+        </w:tc>
+        <w:tc>
+          <w:tcPr>
+            <w:tcW w:w="2520" w:type="dxa"/>
+            <w:vAlign w:val="center"/>
+            <w:hideMark/>
+          </w:tcPr>
+          <w:p>
+            <w:pPr>
+              <w:rPr>
+                <w:lang w:val="en-US"/>
+              </w:rPr>
+            </w:pPr>
+            <w:r>
+              <w:rPr>
+                <w:lang w:val="en-US"/>
+              </w:rPr>
+              <w:t>Tìm kiếm sản phẩm theo tiền tố – TP2</w:t>
+            </w:r>
+          </w:p>
+        </w:tc>
+        <w:tc>
+          <w:tcPr>
+            <w:tcW w:w="2160" w:type="dxa"/>
+            <w:vAlign w:val="center"/>
+            <w:hideMark/>
+          </w:tcPr>
+          <w:p>
+            <w:pPr>
+              <w:rPr>
+                <w:lang w:val="en-US"/>
+              </w:rPr>
+            </w:pPr>
+            <w:r>
+              <w:rPr>
+                <w:lang w:val="en-US"/>
+              </w:rPr>
+              <w:t>Trie</w:t>
+            </w:r>
+          </w:p>
+        </w:tc>
+        <w:tc>
+          <w:tcPr>
+            <w:tcW w:w="2610" w:type="dxa"/>
+            <w:vAlign w:val="center"/>
+            <w:hideMark/>
+          </w:tcPr>
+          <w:p>
+            <w:pPr>
+              <w:rPr>
+                <w:lang w:val="en-US"/>
+              </w:rPr>
+            </w:pPr>
+            <w:r>
+              <w:rPr>
+                <w:lang w:val="en-US"/>
+              </w:rPr>
+              <w:t>Tạo dữ liệu và test chức năng tìm kiếm</w:t>
+            </w:r>
+          </w:p>
+        </w:tc>
+      </w:tr>
+      <w:tr>
+        <w:trPr>
+          <w:trHeight w:val="1160"/>
+        </w:trPr>
+        <w:tc>
+          <w:tcPr>
+            <w:tcW w:w="2695" w:type="dxa"/>
+            <w:vAlign w:val="center"/>
+            <w:hideMark/>
+          </w:tcPr>
+          <w:p>
+            <w:pPr>
+              <w:rPr>
+                <w:lang w:val="en-US"/>
+              </w:rPr>
+            </w:pPr>
+            <w:r>
+              <w:rPr>
+                <w:lang w:val="en-US"/>
+              </w:rPr>
+              <w:t>Nguyễn Thị Kiều Trang</w:t>
+            </w:r>
+          </w:p>
+        </w:tc>
+        <w:tc>
+          <w:tcPr>
+            <w:tcW w:w="2520" w:type="dxa"/>
+            <w:vAlign w:val="center"/>
+            <w:hideMark/>
+          </w:tcPr>
+          <w:p>
+            <w:pPr>
+              <w:rPr>
+                <w:lang w:val="en-US"/>
+              </w:rPr>
+            </w:pPr>
+            <w:r>
+              <w:rPr>
+                <w:lang w:val="en-US"/>
+              </w:rPr>
+              <w:t>Tra cứu sản phẩm / đơn hàng theo mã – MC1</w:t>
+            </w:r>
+          </w:p>
+        </w:tc>
+        <w:tc>
+          <w:tcPr>
+            <w:tcW w:w="2160" w:type="dxa"/>
+            <w:vAlign w:val="center"/>
+            <w:hideMark/>
+          </w:tcPr>
+          <w:p>
+            <w:pPr>
+              <w:rPr>
+                <w:lang w:val="en-US"/>
+              </w:rPr>
+            </w:pPr>
+            <w:r>
+              <w:rPr>
+                <w:lang w:val="en-US"/>
+              </w:rPr>
+              <w:t>Hash Table</w:t>
+            </w:r>
+          </w:p>
+        </w:tc>
+        <w:tc>
+          <w:tcPr>
+            <w:tcW w:w="2610" w:type="dxa"/>
+            <w:vAlign w:val="center"/>
+            <w:hideMark/>
+          </w:tcPr>
+          <w:p>
+            <w:pPr>
+              <w:rPr>
+                <w:lang w:val="en-US"/>
+              </w:rPr>
+            </w:pPr>
+            <w:r>
+              <w:rPr>
+                <w:lang w:val="en-US"/>
+              </w:rPr>
+              <w:t>Đọc/ghi CSV hoặc JSON</w:t>
+            </w:r>
+          </w:p>
+        </w:tc>
+      </w:tr>
+      <w:tr>
+        <w:trPr>
+          <w:trHeight w:val="1160"/>
+        </w:trPr>
+        <w:tc>
+          <w:tcPr>
+            <w:tcW w:w="2695" w:type="dxa"/>
+            <w:vAlign w:val="center"/>
+            <w:hideMark/>
+          </w:tcPr>
+          <w:p>
+            <w:pPr>
+              <w:rPr>
+                <w:lang w:val="en-US"/>
+              </w:rPr>
+            </w:pPr>
+            <w:r>
+              <w:rPr>
+                <w:lang w:val="en-US"/>
+              </w:rPr>
+              <w:t>Nguyễn Thị Ngọc Trâm</w:t>
+            </w:r>
+          </w:p>
+        </w:tc>
+        <w:tc>
+          <w:tcPr>
+            <w:tcW w:w="2520" w:type="dxa"/>
+            <w:vAlign w:val="center"/>
+            <w:hideMark/>
+          </w:tcPr>
+          <w:p>
+            <w:pPr>
+              <w:rPr>
+                <w:lang w:val="en-US"/>
+              </w:rPr>
+            </w:pPr>
+            <w:r>
+              <w:rPr>
+                <w:lang w:val="en-US"/>
+              </w:rPr>
+              <w:t>Danh sách sản phẩm cập nhật gần nhất – TP3</w:t>
+            </w:r>
+          </w:p>
+        </w:tc>
+        <w:tc>
+          <w:tcPr>
+            <w:tcW w:w="2160" w:type="dxa"/>
+            <w:vAlign w:val="center"/>
+            <w:hideMark/>
+          </w:tcPr>
+          <w:p>
+            <w:pPr>
+              <w:rPr>
+                <w:lang w:val="en-US"/>
+              </w:rPr>
+            </w:pPr>
+            <w:r>
+              <w:rPr>
+                <w:lang w:val="en-US"/>
+              </w:rPr>
+              <w:t>Doubly Linked List + Hash Map</w:t>
+            </w:r>
+          </w:p>
+        </w:tc>
+        <w:tc>
+          <w:tcPr>
+            <w:tcW w:w="2610" w:type="dxa"/>
+            <w:vAlign w:val="center"/>
+            <w:hideMark/>
+          </w:tcPr>
+          <w:p>
+            <w:pPr>
+              <w:rPr>
+                <w:lang w:val="en-US"/>
+              </w:rPr>
+            </w:pPr>
+            <w:r>
+              <w:rPr>
+                <w:lang w:val="en-US"/>
+              </w:rPr>
+              <w:t>Kiểm thử toàn bộ hệ thống</w:t>
+            </w:r>
+          </w:p>
+        </w:tc>
+      </w:tr>
+      <w:tr>
+        <w:trPr>
+          <w:trHeight w:val="1151"/>
+        </w:trPr>
+        <w:tc>
+          <w:tcPr>
+            <w:tcW w:w="2695" w:type="dxa"/>
+            <w:vAlign w:val="center"/>
+            <w:hideMark/>
+          </w:tcPr>
+          <w:p>
+            <w:pPr>
+              <w:rPr>
+                <w:lang w:val="en-US"/>
+              </w:rPr>
+            </w:pPr>
+            <w:r>
+              <w:rPr>
+                <w:lang w:val="en-US"/>
+              </w:rPr>
+              <w:t>Bùi Nguyễn Nguyên Khang</w:t>
+            </w:r>
+          </w:p>
+        </w:tc>
+        <w:tc>
+          <w:tcPr>
+            <w:tcW w:w="2520" w:type="dxa"/>
+            <w:vAlign w:val="center"/>
+            <w:hideMark/>
+          </w:tcPr>
+          <w:p>
+            <w:pPr>
+              <w:rPr>
+                <w:lang w:val="en-US"/>
+              </w:rPr>
+            </w:pPr>
+            <w:r>
+              <w:rPr>
+                <w:lang w:val="en-US"/>
+              </w:rPr>
+              <w:t>Giải thuật + đánh giá hiệu năng</w:t>
+            </w:r>
+          </w:p>
+        </w:tc>
+        <w:tc>
+          <w:tcPr>
+            <w:tcW w:w="2160" w:type="dxa"/>
+            <w:vAlign w:val="center"/>
+            <w:hideMark/>
+          </w:tcPr>
+          <w:p>
+            <w:pPr>
+              <w:rPr>
+                <w:lang w:val="en-US"/>
+              </w:rPr>
+            </w:pPr>
+            <w:r>
+              <w:rPr>
+                <w:lang w:val="en-US"/>
+              </w:rPr>
+              <w:t>Merge Sort + Binary Search + Linear Search</w:t>
+            </w:r>
+          </w:p>
+        </w:tc>
+        <w:tc>
+          <w:tcPr>
+            <w:tcW w:w="2610" w:type="dxa"/>
+            <w:vAlign w:val="center"/>
+            <w:hideMark/>
+          </w:tcPr>
+          <w:p>
+            <w:pPr>
+              <w:rPr>
+                <w:lang w:val="en-US"/>
+              </w:rPr>
+            </w:pPr>
+            <w:r>
+              <w:rPr>
+                <w:lang w:val="en-US"/>
+              </w:rPr>
+              <w:t>Benchmark, biểu đồ hiệu năng, frontend demo nếu cần</w:t>
+            </w:r>
+          </w:p>
+        </w:tc>
+      </w:tr>
+    </w:tbl>
+    <w:p>
+      <w:pPr>
+        <w:spacing w:after="100" w:line="360" w:lineRule="auto"/>
+        <w:ind w:left="240"/>
+        <w:jc w:val="both"/>
+        <w:rPr>
+          <w:b/>
+          <w:bCs/>
+          <w:sz w:val="32"/>
+          <w:szCs w:val="32"/>
+          <w:lang w:val="en-US"/>
+        </w:rPr>
+      </w:pPr>
     </w:p>
     <w:sectPr>
       <w:pgSz w:w="11907" w:h="16840"/>
@@ -5887,7 +6890,7 @@
         <w:color w:val="000000"/>
         <w:sz w:val="26"/>
         <w:szCs w:val="26"/>
-        <w:lang w:val="en-VN" w:eastAsia="en-US" w:bidi="ar-SA"/>
+        <w:lang w:eastAsia="en-US" w:bidi="ar-SA"/>
       </w:rPr>
     </w:rPrDefault>
     <w:pPrDefault/>
@@ -6357,7 +7360,6 @@
   <w:style w:type="character" w:default="1" w:styleId="DefaultParagraphFont">
     <w:name w:val="Default Paragraph Font"/>
     <w:uiPriority w:val="1"/>
-    <w:semiHidden/>
     <w:unhideWhenUsed/>
   </w:style>
   <w:style w:type="table" w:default="1" w:styleId="TableNormal">
@@ -6486,6 +7488,22 @@
         <w:right w:val="single" w:sz="4" w:space="0" w:color="auto"/>
         <w:insideH w:val="single" w:sz="4" w:space="0" w:color="auto"/>
         <w:insideV w:val="single" w:sz="4" w:space="0" w:color="auto"/>
+      </w:tblBorders>
+    </w:tblPr>
+  </w:style>
+  <w:style w:type="table" w:styleId="TableGridLight">
+    <w:name w:val="Grid Table Light"/>
+    <w:basedOn w:val="TableNormal"/>
+    <w:uiPriority w:val="40"/>
+    <w:rsid w:val="00053F44"/>
+    <w:tblPr>
+      <w:tblBorders>
+        <w:top w:val="single" w:sz="4" w:space="0" w:color="BFBFBF" w:themeColor="background1" w:themeShade="BF"/>
+        <w:left w:val="single" w:sz="4" w:space="0" w:color="BFBFBF" w:themeColor="background1" w:themeShade="BF"/>
+        <w:bottom w:val="single" w:sz="4" w:space="0" w:color="BFBFBF" w:themeColor="background1" w:themeShade="BF"/>
+        <w:right w:val="single" w:sz="4" w:space="0" w:color="BFBFBF" w:themeColor="background1" w:themeShade="BF"/>
+        <w:insideH w:val="single" w:sz="4" w:space="0" w:color="BFBFBF" w:themeColor="background1" w:themeShade="BF"/>
+        <w:insideV w:val="single" w:sz="4" w:space="0" w:color="BFBFBF" w:themeColor="background1" w:themeShade="BF"/>
       </w:tblBorders>
     </w:tblPr>
   </w:style>

</xml_diff>